<commit_message>
Class diagram, ERD, Thesis paper progress
</commit_message>
<xml_diff>
--- a/Szakdolgozat_Piszkozat.docx
+++ b/Szakdolgozat_Piszkozat.docx
@@ -1701,9 +1701,10 @@
               <w:b w:val="0"/>
               <w:bCs w:val="0"/>
               <w:noProof/>
-              <w:sz w:val="22"/>
-              <w:szCs w:val="22"/>
+              <w:kern w:val="2"/>
+              <w:szCs w:val="24"/>
               <w:lang w:eastAsia="hu-HU"/>
+              <w14:ligatures w14:val="standardContextual"/>
             </w:rPr>
           </w:pPr>
           <w:r>
@@ -1715,7 +1716,7 @@
           <w:r>
             <w:fldChar w:fldCharType="separate"/>
           </w:r>
-          <w:hyperlink w:anchor="_Toc99107193" w:history="1">
+          <w:hyperlink w:anchor="_Toc214225545" w:history="1">
             <w:r>
               <w:rPr>
                 <w:rStyle w:val="Hiperhivatkozs"/>
@@ -1742,7 +1743,7 @@
                 <w:noProof/>
                 <w:webHidden/>
               </w:rPr>
-              <w:instrText xml:space="preserve"> PAGEREF _Toc99107193 \h </w:instrText>
+              <w:instrText xml:space="preserve"> PAGEREF _Toc214225545 \h </w:instrText>
             </w:r>
             <w:r>
               <w:rPr>
@@ -1762,7 +1763,7 @@
                 <w:noProof/>
                 <w:webHidden/>
               </w:rPr>
-              <w:t>8</w:t>
+              <w:t>10</w:t>
             </w:r>
             <w:r>
               <w:rPr>
@@ -1781,16 +1782,16 @@
               <w:b w:val="0"/>
               <w:bCs w:val="0"/>
               <w:noProof/>
-              <w:sz w:val="22"/>
-              <w:szCs w:val="22"/>
+              <w:kern w:val="2"/>
+              <w:szCs w:val="24"/>
               <w:lang w:eastAsia="hu-HU"/>
+              <w14:ligatures w14:val="standardContextual"/>
             </w:rPr>
           </w:pPr>
-          <w:hyperlink w:anchor="_Toc99107194" w:history="1">
+          <w:hyperlink w:anchor="_Toc214225546" w:history="1">
             <w:r>
               <w:rPr>
                 <w:rStyle w:val="Hiperhivatkozs"/>
-                <w:rFonts w:ascii="Arial" w:hAnsi="Arial"/>
                 <w:noProof/>
               </w:rPr>
               <w:t>1.</w:t>
@@ -1801,9 +1802,10 @@
                 <w:b w:val="0"/>
                 <w:bCs w:val="0"/>
                 <w:noProof/>
-                <w:sz w:val="22"/>
-                <w:szCs w:val="22"/>
+                <w:kern w:val="2"/>
+                <w:szCs w:val="24"/>
                 <w:lang w:eastAsia="hu-HU"/>
+                <w14:ligatures w14:val="standardContextual"/>
               </w:rPr>
               <w:tab/>
             </w:r>
@@ -1812,7 +1814,7 @@
                 <w:rStyle w:val="Hiperhivatkozs"/>
                 <w:noProof/>
               </w:rPr>
-              <w:t>Fejezet</w:t>
+              <w:t>Bevezetés</w:t>
             </w:r>
             <w:r>
               <w:rPr>
@@ -1833,7 +1835,7 @@
                 <w:noProof/>
                 <w:webHidden/>
               </w:rPr>
-              <w:instrText xml:space="preserve"> PAGEREF _Toc99107194 \h </w:instrText>
+              <w:instrText xml:space="preserve"> PAGEREF _Toc214225546 \h </w:instrText>
             </w:r>
             <w:r>
               <w:rPr>
@@ -1853,7 +1855,99 @@
                 <w:noProof/>
                 <w:webHidden/>
               </w:rPr>
-              <w:t>9</w:t>
+              <w:t>11</w:t>
+            </w:r>
+            <w:r>
+              <w:rPr>
+                <w:noProof/>
+                <w:webHidden/>
+              </w:rPr>
+              <w:fldChar w:fldCharType="end"/>
+            </w:r>
+          </w:hyperlink>
+        </w:p>
+        <w:p>
+          <w:pPr>
+            <w:pStyle w:val="TJ1"/>
+            <w:rPr>
+              <w:rFonts w:asciiTheme="minorHAnsi" w:eastAsiaTheme="minorEastAsia" w:hAnsiTheme="minorHAnsi" w:cstheme="minorBidi"/>
+              <w:b w:val="0"/>
+              <w:bCs w:val="0"/>
+              <w:noProof/>
+              <w:kern w:val="2"/>
+              <w:szCs w:val="24"/>
+              <w:lang w:eastAsia="hu-HU"/>
+              <w14:ligatures w14:val="standardContextual"/>
+            </w:rPr>
+          </w:pPr>
+          <w:hyperlink w:anchor="_Toc214225547" w:history="1">
+            <w:r>
+              <w:rPr>
+                <w:rStyle w:val="Hiperhivatkozs"/>
+                <w:noProof/>
+              </w:rPr>
+              <w:t>2.</w:t>
+            </w:r>
+            <w:r>
+              <w:rPr>
+                <w:rFonts w:asciiTheme="minorHAnsi" w:eastAsiaTheme="minorEastAsia" w:hAnsiTheme="minorHAnsi" w:cstheme="minorBidi"/>
+                <w:b w:val="0"/>
+                <w:bCs w:val="0"/>
+                <w:noProof/>
+                <w:kern w:val="2"/>
+                <w:szCs w:val="24"/>
+                <w:lang w:eastAsia="hu-HU"/>
+                <w14:ligatures w14:val="standardContextual"/>
+              </w:rPr>
+              <w:tab/>
+            </w:r>
+            <w:r>
+              <w:rPr>
+                <w:rStyle w:val="Hiperhivatkozs"/>
+                <w:noProof/>
+              </w:rPr>
+              <w:t>Megvalósítás</w:t>
+            </w:r>
+            <w:r>
+              <w:rPr>
+                <w:noProof/>
+                <w:webHidden/>
+              </w:rPr>
+              <w:tab/>
+            </w:r>
+            <w:r>
+              <w:rPr>
+                <w:noProof/>
+                <w:webHidden/>
+              </w:rPr>
+              <w:fldChar w:fldCharType="begin"/>
+            </w:r>
+            <w:r>
+              <w:rPr>
+                <w:noProof/>
+                <w:webHidden/>
+              </w:rPr>
+              <w:instrText xml:space="preserve"> PAGEREF _Toc214225547 \h </w:instrText>
+            </w:r>
+            <w:r>
+              <w:rPr>
+                <w:noProof/>
+                <w:webHidden/>
+              </w:rPr>
+            </w:r>
+            <w:r>
+              <w:rPr>
+                <w:noProof/>
+                <w:webHidden/>
+              </w:rPr>
+              <w:fldChar w:fldCharType="separate"/>
+            </w:r>
+            <w:r>
+              <w:rPr>
+                <w:noProof/>
+                <w:webHidden/>
+              </w:rPr>
+              <w:t>12</w:t>
             </w:r>
             <w:r>
               <w:rPr>
@@ -1870,12 +1964,13 @@
             <w:rPr>
               <w:rFonts w:asciiTheme="minorHAnsi" w:eastAsiaTheme="minorEastAsia" w:hAnsiTheme="minorHAnsi" w:cstheme="minorBidi"/>
               <w:noProof/>
-              <w:sz w:val="22"/>
-              <w:szCs w:val="22"/>
+              <w:kern w:val="2"/>
+              <w:szCs w:val="24"/>
               <w:lang w:eastAsia="hu-HU"/>
+              <w14:ligatures w14:val="standardContextual"/>
             </w:rPr>
           </w:pPr>
-          <w:hyperlink w:anchor="_Toc99107195" w:history="1">
+          <w:hyperlink w:anchor="_Toc214225548" w:history="1">
             <w:r>
               <w:rPr>
                 <w:rStyle w:val="Hiperhivatkozs"/>
@@ -1893,9 +1988,10 @@
               <w:rPr>
                 <w:rFonts w:asciiTheme="minorHAnsi" w:eastAsiaTheme="minorEastAsia" w:hAnsiTheme="minorHAnsi" w:cstheme="minorBidi"/>
                 <w:noProof/>
-                <w:sz w:val="22"/>
-                <w:szCs w:val="22"/>
+                <w:kern w:val="2"/>
+                <w:szCs w:val="24"/>
                 <w:lang w:eastAsia="hu-HU"/>
+                <w14:ligatures w14:val="standardContextual"/>
               </w:rPr>
               <w:tab/>
             </w:r>
@@ -1904,7 +2000,7 @@
                 <w:rStyle w:val="Hiperhivatkozs"/>
                 <w:noProof/>
               </w:rPr>
-              <w:t>Alfejezet</w:t>
+              <w:t>C# Programozási Nyelv</w:t>
             </w:r>
             <w:r>
               <w:rPr>
@@ -1925,7 +2021,7 @@
                 <w:noProof/>
                 <w:webHidden/>
               </w:rPr>
-              <w:instrText xml:space="preserve"> PAGEREF _Toc99107195 \h </w:instrText>
+              <w:instrText xml:space="preserve"> PAGEREF _Toc214225548 \h </w:instrText>
             </w:r>
             <w:r>
               <w:rPr>
@@ -1945,654 +2041,7 @@
                 <w:noProof/>
                 <w:webHidden/>
               </w:rPr>
-              <w:t>9</w:t>
-            </w:r>
-            <w:r>
-              <w:rPr>
-                <w:noProof/>
-                <w:webHidden/>
-              </w:rPr>
-              <w:fldChar w:fldCharType="end"/>
-            </w:r>
-          </w:hyperlink>
-        </w:p>
-        <w:p>
-          <w:pPr>
-            <w:pStyle w:val="TJ3"/>
-            <w:rPr>
-              <w:rFonts w:asciiTheme="minorHAnsi" w:eastAsiaTheme="minorEastAsia" w:hAnsiTheme="minorHAnsi" w:cstheme="minorBidi"/>
-              <w:iCs w:val="0"/>
-              <w:noProof/>
-              <w:sz w:val="22"/>
-              <w:szCs w:val="22"/>
-              <w:lang w:eastAsia="hu-HU"/>
-            </w:rPr>
-          </w:pPr>
-          <w:hyperlink w:anchor="_Toc99107196" w:history="1">
-            <w:r>
-              <w:rPr>
-                <w:rStyle w:val="Hiperhivatkozs"/>
-                <w:rFonts w:ascii="Arial" w:hAnsi="Arial"/>
-                <w:noProof/>
-              </w:rPr>
-              <w:t>1.1.1.</w:t>
-            </w:r>
-            <w:r>
-              <w:rPr>
-                <w:rFonts w:asciiTheme="minorHAnsi" w:eastAsiaTheme="minorEastAsia" w:hAnsiTheme="minorHAnsi" w:cstheme="minorBidi"/>
-                <w:iCs w:val="0"/>
-                <w:noProof/>
-                <w:sz w:val="22"/>
-                <w:szCs w:val="22"/>
-                <w:lang w:eastAsia="hu-HU"/>
-              </w:rPr>
-              <w:tab/>
-            </w:r>
-            <w:r>
-              <w:rPr>
-                <w:rStyle w:val="Hiperhivatkozs"/>
-                <w:noProof/>
-              </w:rPr>
-              <w:t>Alfejezet</w:t>
-            </w:r>
-            <w:r>
-              <w:rPr>
-                <w:noProof/>
-                <w:webHidden/>
-              </w:rPr>
-              <w:tab/>
-            </w:r>
-            <w:r>
-              <w:rPr>
-                <w:noProof/>
-                <w:webHidden/>
-              </w:rPr>
-              <w:fldChar w:fldCharType="begin"/>
-            </w:r>
-            <w:r>
-              <w:rPr>
-                <w:noProof/>
-                <w:webHidden/>
-              </w:rPr>
-              <w:instrText xml:space="preserve"> PAGEREF _Toc99107196 \h </w:instrText>
-            </w:r>
-            <w:r>
-              <w:rPr>
-                <w:noProof/>
-                <w:webHidden/>
-              </w:rPr>
-            </w:r>
-            <w:r>
-              <w:rPr>
-                <w:noProof/>
-                <w:webHidden/>
-              </w:rPr>
-              <w:fldChar w:fldCharType="separate"/>
-            </w:r>
-            <w:r>
-              <w:rPr>
-                <w:noProof/>
-                <w:webHidden/>
-              </w:rPr>
-              <w:t>9</w:t>
-            </w:r>
-            <w:r>
-              <w:rPr>
-                <w:noProof/>
-                <w:webHidden/>
-              </w:rPr>
-              <w:fldChar w:fldCharType="end"/>
-            </w:r>
-          </w:hyperlink>
-        </w:p>
-        <w:p>
-          <w:pPr>
-            <w:pStyle w:val="TJ1"/>
-            <w:rPr>
-              <w:rFonts w:asciiTheme="minorHAnsi" w:eastAsiaTheme="minorEastAsia" w:hAnsiTheme="minorHAnsi" w:cstheme="minorBidi"/>
-              <w:b w:val="0"/>
-              <w:bCs w:val="0"/>
-              <w:noProof/>
-              <w:sz w:val="22"/>
-              <w:szCs w:val="22"/>
-              <w:lang w:eastAsia="hu-HU"/>
-            </w:rPr>
-          </w:pPr>
-          <w:hyperlink w:anchor="_Toc99107197" w:history="1">
-            <w:r>
-              <w:rPr>
-                <w:rStyle w:val="Hiperhivatkozs"/>
-                <w:rFonts w:ascii="Arial" w:hAnsi="Arial"/>
-                <w:noProof/>
-              </w:rPr>
-              <w:t>2.</w:t>
-            </w:r>
-            <w:r>
-              <w:rPr>
-                <w:rFonts w:asciiTheme="minorHAnsi" w:eastAsiaTheme="minorEastAsia" w:hAnsiTheme="minorHAnsi" w:cstheme="minorBidi"/>
-                <w:b w:val="0"/>
-                <w:bCs w:val="0"/>
-                <w:noProof/>
-                <w:sz w:val="22"/>
-                <w:szCs w:val="22"/>
-                <w:lang w:eastAsia="hu-HU"/>
-              </w:rPr>
-              <w:tab/>
-            </w:r>
-            <w:r>
-              <w:rPr>
-                <w:rStyle w:val="Hiperhivatkozs"/>
-                <w:noProof/>
-              </w:rPr>
-              <w:t>Új fejezet</w:t>
-            </w:r>
-            <w:r>
-              <w:rPr>
-                <w:noProof/>
-                <w:webHidden/>
-              </w:rPr>
-              <w:tab/>
-            </w:r>
-            <w:r>
-              <w:rPr>
-                <w:noProof/>
-                <w:webHidden/>
-              </w:rPr>
-              <w:fldChar w:fldCharType="begin"/>
-            </w:r>
-            <w:r>
-              <w:rPr>
-                <w:noProof/>
-                <w:webHidden/>
-              </w:rPr>
-              <w:instrText xml:space="preserve"> PAGEREF _Toc99107197 \h </w:instrText>
-            </w:r>
-            <w:r>
-              <w:rPr>
-                <w:noProof/>
-                <w:webHidden/>
-              </w:rPr>
-            </w:r>
-            <w:r>
-              <w:rPr>
-                <w:noProof/>
-                <w:webHidden/>
-              </w:rPr>
-              <w:fldChar w:fldCharType="separate"/>
-            </w:r>
-            <w:r>
-              <w:rPr>
-                <w:noProof/>
-                <w:webHidden/>
-              </w:rPr>
-              <w:t>10</w:t>
-            </w:r>
-            <w:r>
-              <w:rPr>
-                <w:noProof/>
-                <w:webHidden/>
-              </w:rPr>
-              <w:fldChar w:fldCharType="end"/>
-            </w:r>
-          </w:hyperlink>
-        </w:p>
-        <w:p>
-          <w:pPr>
-            <w:pStyle w:val="TJ2"/>
-            <w:rPr>
-              <w:rFonts w:asciiTheme="minorHAnsi" w:eastAsiaTheme="minorEastAsia" w:hAnsiTheme="minorHAnsi" w:cstheme="minorBidi"/>
-              <w:noProof/>
-              <w:sz w:val="22"/>
-              <w:szCs w:val="22"/>
-              <w:lang w:eastAsia="hu-HU"/>
-            </w:rPr>
-          </w:pPr>
-          <w:hyperlink w:anchor="_Toc99107198" w:history="1">
-            <w:r>
-              <w:rPr>
-                <w:rStyle w:val="Hiperhivatkozs"/>
-                <w:noProof/>
-                <w14:scene3d>
-                  <w14:camera w14:prst="orthographicFront"/>
-                  <w14:lightRig w14:rig="threePt" w14:dir="t">
-                    <w14:rot w14:lat="0" w14:lon="0" w14:rev="0"/>
-                  </w14:lightRig>
-                </w14:scene3d>
-              </w:rPr>
-              <w:t>2.1.</w:t>
-            </w:r>
-            <w:r>
-              <w:rPr>
-                <w:rFonts w:asciiTheme="minorHAnsi" w:eastAsiaTheme="minorEastAsia" w:hAnsiTheme="minorHAnsi" w:cstheme="minorBidi"/>
-                <w:noProof/>
-                <w:sz w:val="22"/>
-                <w:szCs w:val="22"/>
-                <w:lang w:eastAsia="hu-HU"/>
-              </w:rPr>
-              <w:tab/>
-            </w:r>
-            <w:r>
-              <w:rPr>
-                <w:rStyle w:val="Hiperhivatkozs"/>
-                <w:noProof/>
-              </w:rPr>
-              <w:t>Új alfejezet</w:t>
-            </w:r>
-            <w:r>
-              <w:rPr>
-                <w:noProof/>
-                <w:webHidden/>
-              </w:rPr>
-              <w:tab/>
-            </w:r>
-            <w:r>
-              <w:rPr>
-                <w:noProof/>
-                <w:webHidden/>
-              </w:rPr>
-              <w:fldChar w:fldCharType="begin"/>
-            </w:r>
-            <w:r>
-              <w:rPr>
-                <w:noProof/>
-                <w:webHidden/>
-              </w:rPr>
-              <w:instrText xml:space="preserve"> PAGEREF _Toc99107198 \h </w:instrText>
-            </w:r>
-            <w:r>
-              <w:rPr>
-                <w:noProof/>
-                <w:webHidden/>
-              </w:rPr>
-            </w:r>
-            <w:r>
-              <w:rPr>
-                <w:noProof/>
-                <w:webHidden/>
-              </w:rPr>
-              <w:fldChar w:fldCharType="separate"/>
-            </w:r>
-            <w:r>
-              <w:rPr>
-                <w:noProof/>
-                <w:webHidden/>
-              </w:rPr>
-              <w:t>10</w:t>
-            </w:r>
-            <w:r>
-              <w:rPr>
-                <w:noProof/>
-                <w:webHidden/>
-              </w:rPr>
-              <w:fldChar w:fldCharType="end"/>
-            </w:r>
-          </w:hyperlink>
-        </w:p>
-        <w:p>
-          <w:pPr>
-            <w:pStyle w:val="TJ1"/>
-            <w:rPr>
-              <w:rFonts w:asciiTheme="minorHAnsi" w:eastAsiaTheme="minorEastAsia" w:hAnsiTheme="minorHAnsi" w:cstheme="minorBidi"/>
-              <w:b w:val="0"/>
-              <w:bCs w:val="0"/>
-              <w:noProof/>
-              <w:sz w:val="22"/>
-              <w:szCs w:val="22"/>
-              <w:lang w:eastAsia="hu-HU"/>
-            </w:rPr>
-          </w:pPr>
-          <w:hyperlink w:anchor="_Toc99107199" w:history="1">
-            <w:r>
-              <w:rPr>
-                <w:rStyle w:val="Hiperhivatkozs"/>
-                <w:rFonts w:ascii="Arial" w:hAnsi="Arial"/>
-                <w:noProof/>
-              </w:rPr>
-              <w:t>3.</w:t>
-            </w:r>
-            <w:r>
-              <w:rPr>
-                <w:rFonts w:asciiTheme="minorHAnsi" w:eastAsiaTheme="minorEastAsia" w:hAnsiTheme="minorHAnsi" w:cstheme="minorBidi"/>
-                <w:b w:val="0"/>
-                <w:bCs w:val="0"/>
-                <w:noProof/>
-                <w:sz w:val="22"/>
-                <w:szCs w:val="22"/>
-                <w:lang w:eastAsia="hu-HU"/>
-              </w:rPr>
-              <w:tab/>
-            </w:r>
-            <w:r>
-              <w:rPr>
-                <w:rStyle w:val="Hiperhivatkozs"/>
-                <w:noProof/>
-              </w:rPr>
-              <w:t>Instrukciók</w:t>
-            </w:r>
-            <w:r>
-              <w:rPr>
-                <w:noProof/>
-                <w:webHidden/>
-              </w:rPr>
-              <w:tab/>
-            </w:r>
-            <w:r>
-              <w:rPr>
-                <w:noProof/>
-                <w:webHidden/>
-              </w:rPr>
-              <w:fldChar w:fldCharType="begin"/>
-            </w:r>
-            <w:r>
-              <w:rPr>
-                <w:noProof/>
-                <w:webHidden/>
-              </w:rPr>
-              <w:instrText xml:space="preserve"> PAGEREF _Toc99107199 \h </w:instrText>
-            </w:r>
-            <w:r>
-              <w:rPr>
-                <w:noProof/>
-                <w:webHidden/>
-              </w:rPr>
-            </w:r>
-            <w:r>
-              <w:rPr>
-                <w:noProof/>
-                <w:webHidden/>
-              </w:rPr>
-              <w:fldChar w:fldCharType="separate"/>
-            </w:r>
-            <w:r>
-              <w:rPr>
-                <w:noProof/>
-                <w:webHidden/>
-              </w:rPr>
-              <w:t>11</w:t>
-            </w:r>
-            <w:r>
-              <w:rPr>
-                <w:noProof/>
-                <w:webHidden/>
-              </w:rPr>
-              <w:fldChar w:fldCharType="end"/>
-            </w:r>
-          </w:hyperlink>
-        </w:p>
-        <w:p>
-          <w:pPr>
-            <w:pStyle w:val="TJ1"/>
-            <w:rPr>
-              <w:rFonts w:asciiTheme="minorHAnsi" w:eastAsiaTheme="minorEastAsia" w:hAnsiTheme="minorHAnsi" w:cstheme="minorBidi"/>
-              <w:b w:val="0"/>
-              <w:bCs w:val="0"/>
-              <w:noProof/>
-              <w:sz w:val="22"/>
-              <w:szCs w:val="22"/>
-              <w:lang w:eastAsia="hu-HU"/>
-            </w:rPr>
-          </w:pPr>
-          <w:hyperlink w:anchor="_Toc99107200" w:history="1">
-            <w:r>
-              <w:rPr>
-                <w:rStyle w:val="Hiperhivatkozs"/>
-                <w:noProof/>
-              </w:rPr>
-              <w:t>Irodalomjegyzék</w:t>
-            </w:r>
-            <w:r>
-              <w:rPr>
-                <w:noProof/>
-                <w:webHidden/>
-              </w:rPr>
-              <w:tab/>
-            </w:r>
-            <w:r>
-              <w:rPr>
-                <w:noProof/>
-                <w:webHidden/>
-              </w:rPr>
-              <w:fldChar w:fldCharType="begin"/>
-            </w:r>
-            <w:r>
-              <w:rPr>
-                <w:noProof/>
-                <w:webHidden/>
-              </w:rPr>
-              <w:instrText xml:space="preserve"> PAGEREF _Toc99107200 \h </w:instrText>
-            </w:r>
-            <w:r>
-              <w:rPr>
-                <w:noProof/>
-                <w:webHidden/>
-              </w:rPr>
-            </w:r>
-            <w:r>
-              <w:rPr>
-                <w:noProof/>
-                <w:webHidden/>
-              </w:rPr>
-              <w:fldChar w:fldCharType="separate"/>
-            </w:r>
-            <w:r>
-              <w:rPr>
-                <w:noProof/>
-                <w:webHidden/>
-              </w:rPr>
               <w:t>12</w:t>
-            </w:r>
-            <w:r>
-              <w:rPr>
-                <w:noProof/>
-                <w:webHidden/>
-              </w:rPr>
-              <w:fldChar w:fldCharType="end"/>
-            </w:r>
-          </w:hyperlink>
-        </w:p>
-        <w:p>
-          <w:pPr>
-            <w:pStyle w:val="TJ1"/>
-            <w:rPr>
-              <w:rFonts w:asciiTheme="minorHAnsi" w:eastAsiaTheme="minorEastAsia" w:hAnsiTheme="minorHAnsi" w:cstheme="minorBidi"/>
-              <w:b w:val="0"/>
-              <w:bCs w:val="0"/>
-              <w:noProof/>
-              <w:sz w:val="22"/>
-              <w:szCs w:val="22"/>
-              <w:lang w:eastAsia="hu-HU"/>
-            </w:rPr>
-          </w:pPr>
-          <w:hyperlink w:anchor="_Toc99107201" w:history="1">
-            <w:r>
-              <w:rPr>
-                <w:rStyle w:val="Hiperhivatkozs"/>
-                <w:noProof/>
-              </w:rPr>
-              <w:t>Mellékletek</w:t>
-            </w:r>
-            <w:r>
-              <w:rPr>
-                <w:noProof/>
-                <w:webHidden/>
-              </w:rPr>
-              <w:tab/>
-            </w:r>
-            <w:r>
-              <w:rPr>
-                <w:noProof/>
-                <w:webHidden/>
-              </w:rPr>
-              <w:fldChar w:fldCharType="begin"/>
-            </w:r>
-            <w:r>
-              <w:rPr>
-                <w:noProof/>
-                <w:webHidden/>
-              </w:rPr>
-              <w:instrText xml:space="preserve"> PAGEREF _Toc99107201 \h </w:instrText>
-            </w:r>
-            <w:r>
-              <w:rPr>
-                <w:noProof/>
-                <w:webHidden/>
-              </w:rPr>
-            </w:r>
-            <w:r>
-              <w:rPr>
-                <w:noProof/>
-                <w:webHidden/>
-              </w:rPr>
-              <w:fldChar w:fldCharType="separate"/>
-            </w:r>
-            <w:r>
-              <w:rPr>
-                <w:noProof/>
-                <w:webHidden/>
-              </w:rPr>
-              <w:t>13</w:t>
-            </w:r>
-            <w:r>
-              <w:rPr>
-                <w:noProof/>
-                <w:webHidden/>
-              </w:rPr>
-              <w:fldChar w:fldCharType="end"/>
-            </w:r>
-          </w:hyperlink>
-        </w:p>
-        <w:p>
-          <w:pPr>
-            <w:pStyle w:val="TJ1"/>
-            <w:rPr>
-              <w:rFonts w:asciiTheme="minorHAnsi" w:eastAsiaTheme="minorEastAsia" w:hAnsiTheme="minorHAnsi" w:cstheme="minorBidi"/>
-              <w:b w:val="0"/>
-              <w:bCs w:val="0"/>
-              <w:noProof/>
-              <w:sz w:val="22"/>
-              <w:szCs w:val="22"/>
-              <w:lang w:eastAsia="hu-HU"/>
-            </w:rPr>
-          </w:pPr>
-          <w:hyperlink w:anchor="_Toc99107202" w:history="1">
-            <w:r>
-              <w:rPr>
-                <w:rStyle w:val="Hiperhivatkozs"/>
-                <w:noProof/>
-              </w:rPr>
-              <w:t>Ábrajegyzék</w:t>
-            </w:r>
-            <w:r>
-              <w:rPr>
-                <w:noProof/>
-                <w:webHidden/>
-              </w:rPr>
-              <w:tab/>
-            </w:r>
-            <w:r>
-              <w:rPr>
-                <w:noProof/>
-                <w:webHidden/>
-              </w:rPr>
-              <w:fldChar w:fldCharType="begin"/>
-            </w:r>
-            <w:r>
-              <w:rPr>
-                <w:noProof/>
-                <w:webHidden/>
-              </w:rPr>
-              <w:instrText xml:space="preserve"> PAGEREF _Toc99107202 \h </w:instrText>
-            </w:r>
-            <w:r>
-              <w:rPr>
-                <w:noProof/>
-                <w:webHidden/>
-              </w:rPr>
-            </w:r>
-            <w:r>
-              <w:rPr>
-                <w:noProof/>
-                <w:webHidden/>
-              </w:rPr>
-              <w:fldChar w:fldCharType="separate"/>
-            </w:r>
-            <w:r>
-              <w:rPr>
-                <w:noProof/>
-                <w:webHidden/>
-              </w:rPr>
-              <w:t>14</w:t>
-            </w:r>
-            <w:r>
-              <w:rPr>
-                <w:noProof/>
-                <w:webHidden/>
-              </w:rPr>
-              <w:fldChar w:fldCharType="end"/>
-            </w:r>
-          </w:hyperlink>
-        </w:p>
-        <w:p>
-          <w:pPr>
-            <w:pStyle w:val="TJ1"/>
-            <w:rPr>
-              <w:rFonts w:asciiTheme="minorHAnsi" w:eastAsiaTheme="minorEastAsia" w:hAnsiTheme="minorHAnsi" w:cstheme="minorBidi"/>
-              <w:b w:val="0"/>
-              <w:bCs w:val="0"/>
-              <w:noProof/>
-              <w:sz w:val="22"/>
-              <w:szCs w:val="22"/>
-              <w:lang w:eastAsia="hu-HU"/>
-            </w:rPr>
-          </w:pPr>
-          <w:hyperlink w:anchor="_Toc99107203" w:history="1">
-            <w:r>
-              <w:rPr>
-                <w:rStyle w:val="Hiperhivatkozs"/>
-                <w:noProof/>
-              </w:rPr>
-              <w:t>Táblázatjegyzék</w:t>
-            </w:r>
-            <w:r>
-              <w:rPr>
-                <w:noProof/>
-                <w:webHidden/>
-              </w:rPr>
-              <w:tab/>
-            </w:r>
-            <w:r>
-              <w:rPr>
-                <w:noProof/>
-                <w:webHidden/>
-              </w:rPr>
-              <w:fldChar w:fldCharType="begin"/>
-            </w:r>
-            <w:r>
-              <w:rPr>
-                <w:noProof/>
-                <w:webHidden/>
-              </w:rPr>
-              <w:instrText xml:space="preserve"> PAGEREF _Toc99107203 \h </w:instrText>
-            </w:r>
-            <w:r>
-              <w:rPr>
-                <w:noProof/>
-                <w:webHidden/>
-              </w:rPr>
-            </w:r>
-            <w:r>
-              <w:rPr>
-                <w:noProof/>
-                <w:webHidden/>
-              </w:rPr>
-              <w:fldChar w:fldCharType="separate"/>
-            </w:r>
-            <w:r>
-              <w:rPr>
-                <w:noProof/>
-                <w:webHidden/>
-              </w:rPr>
-              <w:t>15</w:t>
             </w:r>
             <w:r>
               <w:rPr>
@@ -2652,7 +2101,7 @@
       <w:pPr>
         <w:pStyle w:val="Cmsor1-szmozatlan"/>
       </w:pPr>
-      <w:bookmarkStart w:id="3" w:name="_Toc99107193"/>
+      <w:bookmarkStart w:id="3" w:name="_Toc214225545"/>
       <w:r>
         <w:lastRenderedPageBreak/>
         <w:t>Jelölésjegyzék</w:t>
@@ -3020,16 +2469,1176 @@
           <w:numId w:val="19"/>
         </w:numPr>
       </w:pPr>
-      <w:bookmarkStart w:id="4" w:name="_Toc98926923"/>
-      <w:bookmarkStart w:id="5" w:name="_Toc99107194"/>
+      <w:bookmarkStart w:id="4" w:name="_Toc214225546"/>
       <w:r>
         <w:lastRenderedPageBreak/>
-        <w:t>Fejezet</w:t>
+        <w:t>Bevezetés</w:t>
       </w:r>
       <w:bookmarkEnd w:id="4"/>
+    </w:p>
+    <w:p>
+      <w:pPr>
+        <w:pStyle w:val="Firstparagraph"/>
+      </w:pPr>
+      <w:proofErr w:type="spellStart"/>
+      <w:r>
+        <w:t>Bev</w:t>
+      </w:r>
+      <w:proofErr w:type="spellEnd"/>
+    </w:p>
+    <w:p>
+      <w:pPr>
+        <w:ind w:firstLine="0"/>
+      </w:pPr>
+    </w:p>
+    <w:p>
+      <w:pPr>
+        <w:pStyle w:val="Cmsor1-szmozatlan"/>
+        <w:numPr>
+          <w:ilvl w:val="0"/>
+          <w:numId w:val="19"/>
+        </w:numPr>
+      </w:pPr>
+      <w:bookmarkStart w:id="5" w:name="_Toc214225547"/>
+      <w:r>
+        <w:lastRenderedPageBreak/>
+        <w:t>Megvalósítás</w:t>
+      </w:r>
       <w:bookmarkEnd w:id="5"/>
     </w:p>
+    <w:p>
+      <w:pPr>
+        <w:pStyle w:val="Firstparagraph"/>
+      </w:pPr>
+      <w:r>
+        <w:t xml:space="preserve">Az </w:t>
+      </w:r>
+      <w:proofErr w:type="spellStart"/>
+      <w:r>
+        <w:t>alkamazás</w:t>
+      </w:r>
+      <w:proofErr w:type="spellEnd"/>
+      <w:r>
+        <w:t xml:space="preserve"> megvalósítása egy komplex feladat volt, mivel </w:t>
+      </w:r>
+      <w:proofErr w:type="spellStart"/>
+      <w:r>
+        <w:t>egyzerre</w:t>
+      </w:r>
+      <w:proofErr w:type="spellEnd"/>
+      <w:r>
+        <w:t xml:space="preserve"> </w:t>
+      </w:r>
+      <w:proofErr w:type="gramStart"/>
+      <w:r>
+        <w:t>több féle</w:t>
+      </w:r>
+      <w:proofErr w:type="gramEnd"/>
+      <w:r>
+        <w:t xml:space="preserve"> technológiát kellett ötvözni, hogy egy jól működő, modern és felhasználóbarát termék legyen a végeredmény. Nyelvnek a C# Programozási nyelvet választottam, mivel egy modern, objektum orientált (OO) programozási nyelv, ami lehetővé teszi azt, hogy a kód jól átlátható, moduláris és </w:t>
+      </w:r>
+      <w:proofErr w:type="spellStart"/>
+      <w:r>
+        <w:t>újrefelhasználható</w:t>
+      </w:r>
+      <w:proofErr w:type="spellEnd"/>
+      <w:r>
+        <w:t xml:space="preserve"> legyen.</w:t>
+      </w:r>
+    </w:p>
+    <w:p>
+      <w:pPr>
+        <w:pStyle w:val="Listaszerbekezds"/>
+        <w:keepNext/>
+        <w:keepLines/>
+        <w:numPr>
+          <w:ilvl w:val="0"/>
+          <w:numId w:val="1"/>
+        </w:numPr>
+        <w:spacing w:before="720" w:after="480"/>
+        <w:ind w:left="357" w:hanging="357"/>
+        <w:contextualSpacing w:val="0"/>
+        <w:outlineLvl w:val="0"/>
+        <w:rPr>
+          <w:rFonts w:eastAsiaTheme="majorEastAsia" w:cstheme="majorBidi"/>
+          <w:b/>
+          <w:vanish/>
+          <w:color w:val="000000" w:themeColor="text1"/>
+          <w:sz w:val="28"/>
+          <w:szCs w:val="32"/>
+        </w:rPr>
+      </w:pPr>
+      <w:bookmarkStart w:id="6" w:name="_Toc214225548"/>
+    </w:p>
+    <w:p>
+      <w:pPr>
+        <w:pStyle w:val="Listaszerbekezds"/>
+        <w:keepNext/>
+        <w:keepLines/>
+        <w:numPr>
+          <w:ilvl w:val="0"/>
+          <w:numId w:val="1"/>
+        </w:numPr>
+        <w:spacing w:before="720" w:after="480"/>
+        <w:ind w:left="357" w:hanging="357"/>
+        <w:contextualSpacing w:val="0"/>
+        <w:outlineLvl w:val="0"/>
+        <w:rPr>
+          <w:rFonts w:eastAsiaTheme="majorEastAsia" w:cstheme="majorBidi"/>
+          <w:b/>
+          <w:vanish/>
+          <w:color w:val="000000" w:themeColor="text1"/>
+          <w:sz w:val="28"/>
+          <w:szCs w:val="32"/>
+        </w:rPr>
+      </w:pPr>
+    </w:p>
+    <w:p>
+      <w:pPr>
+        <w:pStyle w:val="Cmsor2"/>
+      </w:pPr>
+      <w:r>
+        <w:t>C# Programozási Nyelv</w:t>
+      </w:r>
+      <w:bookmarkEnd w:id="6"/>
+    </w:p>
+    <w:p>
+      <w:pPr>
+        <w:pStyle w:val="NormlWeb"/>
+      </w:pPr>
+      <w:r>
+        <w:t>A fejlesztés során a C# programozási nyelvet használtam, mivel ez egy modern és jól átgondolt objektumorientált nyelv, amely nagyban megkönnyítette a rendszer különböző részeinek kialakítását. A C# lehetővé tette, hogy a kód jól átlátható, moduláris és hosszú távon is könnyen bővíthető legyen, ami egy ekkora és több funkciót összefogó alkalmazás esetén kifejezetten fontos szempont volt.</w:t>
+      </w:r>
+    </w:p>
+    <w:p>
+      <w:pPr>
+        <w:pStyle w:val="NormlWeb"/>
+      </w:pPr>
+      <w:r>
+        <w:t>A nyelv egyik legnagyobb előnye számomra az volt, hogy nagyon jó típusbiztonságot és hibakezelési lehetőségeket kínál. Egy egészségügyi jellegű rendszerben – ahol érzékeny betegadatokkal és fontos adminisztratív folyamatokkal dolgozunk – különösen fontos, hogy a lehető legkevesebb futási hibával találkozzunk. A C# szigorú típusrendszere sok ilyen problémát már fordítási időben kiszűr, így a fejlesztési folyamat is megbízhatóbbá válik.</w:t>
+      </w:r>
+    </w:p>
+    <w:p>
+      <w:pPr>
+        <w:pStyle w:val="NormlWeb"/>
+      </w:pPr>
+      <w:r>
+        <w:t xml:space="preserve">A projekt során nagy mértékben támaszkodtam a C# egyik erősségére, az </w:t>
+      </w:r>
+      <w:r>
+        <w:rPr>
+          <w:rStyle w:val="Kiemels2"/>
+          <w:rFonts w:eastAsiaTheme="majorEastAsia"/>
+        </w:rPr>
+        <w:t>aszinkron programozásra</w:t>
+      </w:r>
+      <w:r>
+        <w:t>. Az</w:t>
+      </w:r>
+      <w:r>
+        <w:t xml:space="preserve"> </w:t>
+      </w:r>
+      <w:proofErr w:type="spellStart"/>
+      <w:r>
+        <w:rPr>
+          <w:i/>
+          <w:iCs/>
+        </w:rPr>
+        <w:t>async</w:t>
+      </w:r>
+      <w:proofErr w:type="spellEnd"/>
+      <w:r>
+        <w:t xml:space="preserve"> </w:t>
+      </w:r>
+      <w:r>
+        <w:t>és</w:t>
+      </w:r>
+      <w:r>
+        <w:t xml:space="preserve"> </w:t>
+      </w:r>
+      <w:proofErr w:type="spellStart"/>
+      <w:r>
+        <w:rPr>
+          <w:i/>
+          <w:iCs/>
+        </w:rPr>
+        <w:t>await</w:t>
+      </w:r>
+      <w:proofErr w:type="spellEnd"/>
+      <w:r>
+        <w:t xml:space="preserve"> </w:t>
+      </w:r>
+      <w:r>
+        <w:t>kulcsszavak segítségével könnyedén tudtam kezelni azokat a műveleteket, amelyek adatbázishoz vagy hálózathoz kapcsolódtak. Ez különösen az időpontfoglalások és a különböző orvosi adatok lekérdezése során volt nagyon hasznos, mivel így a felhasználói felület nem akadt meg, hanem folyamatosan reagált a gombnyomásokra és más interakciókra.</w:t>
+      </w:r>
+    </w:p>
+    <w:p>
+      <w:pPr>
+        <w:pStyle w:val="NormlWeb"/>
+      </w:pPr>
+      <w:r>
+        <w:t>A C# tökéletesen illeszkedik a .NET ökoszisztémába, így a .NET MAUI-</w:t>
+      </w:r>
+      <w:proofErr w:type="spellStart"/>
+      <w:r>
+        <w:t>val</w:t>
+      </w:r>
+      <w:proofErr w:type="spellEnd"/>
+      <w:r>
+        <w:t xml:space="preserve"> is gond nélkül együttműködik, amely a kliensoldali alkalmazás alapját adta. Ennek köszönhetően ugyanazt az üzleti logikát használhattam mobilon és asztali környezetben is, ami nemcsak felgyorsította a fejlesztést, hanem átláthatóbbá is tette a projektet.</w:t>
+      </w:r>
+    </w:p>
+    <w:p>
+      <w:pPr>
+        <w:pStyle w:val="NormlWeb"/>
+      </w:pPr>
+      <w:r>
+        <w:t>A C#-ot többek között a következő feladatokhoz használtam:</w:t>
+      </w:r>
+    </w:p>
+    <w:p>
+      <w:pPr>
+        <w:pStyle w:val="NormlWeb"/>
+        <w:numPr>
+          <w:ilvl w:val="0"/>
+          <w:numId w:val="22"/>
+        </w:numPr>
+      </w:pPr>
+      <w:r>
+        <w:t>az entitások (páciensek, orvosok, gyógyszerek) megvalósítása és kezelése,</w:t>
+      </w:r>
+    </w:p>
+    <w:p>
+      <w:pPr>
+        <w:pStyle w:val="NormlWeb"/>
+        <w:numPr>
+          <w:ilvl w:val="0"/>
+          <w:numId w:val="22"/>
+        </w:numPr>
+      </w:pPr>
+      <w:r>
+        <w:t xml:space="preserve">az adatbázissal való kommunikáció előkészítése és megvalósítása (LINQ lekérdezések, EF </w:t>
+      </w:r>
+      <w:proofErr w:type="spellStart"/>
+      <w:r>
+        <w:t>Core</w:t>
+      </w:r>
+      <w:proofErr w:type="spellEnd"/>
+      <w:r>
+        <w:t xml:space="preserve"> műveletek)</w:t>
+      </w:r>
+      <w:r>
+        <w:t>,</w:t>
+      </w:r>
+    </w:p>
+    <w:p>
+      <w:pPr>
+        <w:pStyle w:val="NormlWeb"/>
+        <w:numPr>
+          <w:ilvl w:val="0"/>
+          <w:numId w:val="22"/>
+        </w:numPr>
+      </w:pPr>
+      <w:r>
+        <w:t>az időpontfoglalások logikájának felépítése</w:t>
+      </w:r>
+      <w:r>
+        <w:t>,</w:t>
+      </w:r>
+    </w:p>
+    <w:p>
+      <w:pPr>
+        <w:pStyle w:val="NormlWeb"/>
+        <w:numPr>
+          <w:ilvl w:val="0"/>
+          <w:numId w:val="22"/>
+        </w:numPr>
+      </w:pPr>
+      <w:r>
+        <w:t>emlékeztetők, értesítések, háttérműveletek kezelése a felhasználói élmény javítása érdekében,</w:t>
+      </w:r>
+    </w:p>
+    <w:p>
+      <w:pPr>
+        <w:pStyle w:val="NormlWeb"/>
+        <w:numPr>
+          <w:ilvl w:val="0"/>
+          <w:numId w:val="22"/>
+        </w:numPr>
+      </w:pPr>
+      <w:r>
+        <w:t>valamint a kliensoldali MAUI felület működésének vezérlése.</w:t>
+      </w:r>
+    </w:p>
+    <w:p>
+      <w:pPr>
+        <w:pStyle w:val="NormlWeb"/>
+      </w:pPr>
+      <w:r>
+        <w:lastRenderedPageBreak/>
+        <w:t>Összességében a C# egy olyan stabil és sokoldalú eszköz volt a projekt során, amely nagyban hozzájárult ahhoz, hogy a rendszer teljes egészében átlátható, megbízható és könnyen továbbfejleszthető legyen. Úgy érzem, hogy a nyelv választása teljes mértékben indokolt volt, és jól támogatta a szakdolgozatom céljait</w:t>
+      </w:r>
+      <w:r>
+        <w:t>.</w:t>
+      </w:r>
+    </w:p>
+    <w:p>
+      <w:pPr>
+        <w:pStyle w:val="Cmsor2"/>
+      </w:pPr>
+      <w:r>
+        <w:t>.NET MAUI mint az alkalmazás front-end keretrendszere</w:t>
+      </w:r>
+    </w:p>
+    <w:p>
+      <w:pPr>
+        <w:pStyle w:val="Firstparagraph"/>
+      </w:pPr>
+      <w:r>
+        <w:t xml:space="preserve">Az alkalmazás felhasználói felületének megvalósításához a </w:t>
+      </w:r>
+      <w:r>
+        <w:rPr>
+          <w:b/>
+          <w:bCs/>
+        </w:rPr>
+        <w:t>.NET MAUI</w:t>
+      </w:r>
+      <w:r>
+        <w:t xml:space="preserve"> keretrendszert használtam, amely a Microsoft modern, többplatformos fejlesztési megoldása. A MAUI lehetővé teszi, hogy ugyanazzal a kódbázissal készítsek mobil- és asztali alkalmazást is, így nem kellett külön Android, Windows vagy más céleszközre külön frontendet fejleszteni. Ez nagyban leegyszerűsítette a fejlesztési folyamatot, és sok időt megspórolt.</w:t>
+      </w:r>
+    </w:p>
+    <w:p>
+      <w:pPr>
+        <w:pStyle w:val="Firstparagraph"/>
+      </w:pPr>
+      <w:r>
+        <w:t xml:space="preserve">A keretrendszer egyik legnagyobb előnye, hogy a felhasználói felület komponensei egységesen működnek minden platformon, mégis </w:t>
+      </w:r>
+      <w:proofErr w:type="spellStart"/>
+      <w:r>
+        <w:t>megőrzik</w:t>
+      </w:r>
+      <w:proofErr w:type="spellEnd"/>
+      <w:r>
+        <w:t xml:space="preserve"> a natív jellegüket. Ez azt jelenti, hogy a felhasználók mindegyik eszközön olyan érzést kapnak, mintha az alkalmazás kifejezetten arra a platformra készült volna. Számomra fejlesztőként pedig az volt a legfontosabb, hogy a logika és a megjelenítés nagy része közös lehessen.</w:t>
+      </w:r>
+    </w:p>
+    <w:p>
+      <w:pPr>
+        <w:pStyle w:val="Firstparagraph"/>
+      </w:pPr>
+      <w:r>
+        <w:t xml:space="preserve">A MAUI XAML-alapú felületleírást használ, ami nagyon jól strukturálható és könnyen karbantartható. A UI elemek gyorsan átláthatók, a </w:t>
+      </w:r>
+      <w:proofErr w:type="spellStart"/>
+      <w:r>
+        <w:t>layouthoz</w:t>
+      </w:r>
+      <w:proofErr w:type="spellEnd"/>
+      <w:r>
+        <w:t xml:space="preserve"> tartozó logika pedig egyszerűen hozzákapcsolható a C# kódban. A projekt során így egy rendezett és tiszta felépítésű felhasználói felületet tudtam kialakítani. Mivel az alkalmazás célja az volt, hogy a kezelőorvosok és a páciensek is könnyen eligazodjanak benne, a MAUI-</w:t>
+      </w:r>
+      <w:proofErr w:type="spellStart"/>
+      <w:r>
+        <w:t>nak</w:t>
+      </w:r>
+      <w:proofErr w:type="spellEnd"/>
+      <w:r>
+        <w:t xml:space="preserve"> köszönhetően könnyedén összerakhattam egy intuitív, egyszerűen használható UI-t.</w:t>
+      </w:r>
+    </w:p>
+    <w:p>
+      <w:pPr>
+        <w:pStyle w:val="Firstparagraph"/>
+      </w:pPr>
+      <w:r>
+        <w:t>A MAUI nagy előnye még az MVVM (</w:t>
+      </w:r>
+      <w:proofErr w:type="spellStart"/>
+      <w:r>
+        <w:t>Model-View-ViewModel</w:t>
+      </w:r>
+      <w:proofErr w:type="spellEnd"/>
+      <w:r>
+        <w:t xml:space="preserve">) mintázat támogatása, amely jól illeszkedett az alkalmazás felépítéséhez. Ennek köszönhetően a megjelenítés </w:t>
+      </w:r>
+      <w:proofErr w:type="spellStart"/>
+      <w:r>
+        <w:t>rétege</w:t>
+      </w:r>
+      <w:proofErr w:type="spellEnd"/>
+      <w:r>
+        <w:t xml:space="preserve"> szépen elkülönült az üzleti logikától, így a kód átláthatóbb, modulárisabb és hibakeresés szempontjából is könnyebben kezelhető lett. Az </w:t>
+      </w:r>
+      <w:proofErr w:type="spellStart"/>
+      <w:r>
+        <w:t>adatbindelések</w:t>
+      </w:r>
+      <w:proofErr w:type="spellEnd"/>
+      <w:r>
+        <w:t xml:space="preserve"> segítségével pedig sok UI frissítés automatikusan megtörtént, így a fejlesztés gyorsabban és kevesebb kézi beavatkozással zajlott.</w:t>
+      </w:r>
+    </w:p>
+    <w:p>
+      <w:pPr>
+        <w:pStyle w:val="Firstparagraph"/>
+      </w:pPr>
+      <w:r>
+        <w:t>A frontenden a MAUI-t főként a következő feladatokra használtam:</w:t>
+      </w:r>
+    </w:p>
+    <w:p>
+      <w:pPr>
+        <w:pStyle w:val="Firstparagraph"/>
+        <w:numPr>
+          <w:ilvl w:val="0"/>
+          <w:numId w:val="23"/>
+        </w:numPr>
+      </w:pPr>
+      <w:r>
+        <w:t>a pácienseknek szóló felületek megvalósítása (időpontfoglalás, gyógyszeremlékeztetők, saját adatok megtekintése),</w:t>
+      </w:r>
+    </w:p>
+    <w:p>
+      <w:pPr>
+        <w:pStyle w:val="Firstparagraph"/>
+        <w:numPr>
+          <w:ilvl w:val="0"/>
+          <w:numId w:val="23"/>
+        </w:numPr>
+      </w:pPr>
+      <w:r>
+        <w:t>az orvosok számára készült funkciók kialakítása (időbeosztás kezelése, páciensek adatainak megtekintése),</w:t>
+      </w:r>
+    </w:p>
+    <w:p>
+      <w:pPr>
+        <w:pStyle w:val="Firstparagraph"/>
+        <w:numPr>
+          <w:ilvl w:val="0"/>
+          <w:numId w:val="23"/>
+        </w:numPr>
+      </w:pPr>
+      <w:r>
+        <w:t>különböző űrlapok, listák, naptárak és részletes nézetek létrehozása,</w:t>
+      </w:r>
+    </w:p>
+    <w:p>
+      <w:pPr>
+        <w:pStyle w:val="Firstparagraph"/>
+        <w:numPr>
+          <w:ilvl w:val="0"/>
+          <w:numId w:val="23"/>
+        </w:numPr>
+      </w:pPr>
+      <w:r>
+        <w:lastRenderedPageBreak/>
+        <w:t>navigációs logika és képernyőváltások kezelése,</w:t>
+      </w:r>
+    </w:p>
+    <w:p>
+      <w:pPr>
+        <w:pStyle w:val="Firstparagraph"/>
+        <w:numPr>
+          <w:ilvl w:val="0"/>
+          <w:numId w:val="23"/>
+        </w:numPr>
+      </w:pPr>
+      <w:r>
+        <w:t>esztétikus és könnyen értelmezhető felület kialakítása minden platformon.</w:t>
+      </w:r>
+    </w:p>
     <w:p/>
+    <w:p>
+      <w:pPr>
+        <w:pStyle w:val="Firstparagraph"/>
+      </w:pPr>
+      <w:r>
+        <w:t>A .NET MAUI tehát egy olyan frontend keretrendszer volt, amely tökéletesen illeszkedett a szakdolgozatom témájához. Egyszerre volt modern, rugalmas és könnyen használható, és nagyban hozzájárult ahhoz, hogy az alkalmazás könnyen kezelhető és a felhasználók számára átlátható legyen.</w:t>
+      </w:r>
+    </w:p>
+    <w:p>
+      <w:pPr>
+        <w:ind w:firstLine="0"/>
+      </w:pPr>
+    </w:p>
+    <w:p>
+      <w:pPr>
+        <w:pStyle w:val="Cmsor2"/>
+      </w:pPr>
+      <w:r>
+        <w:t xml:space="preserve">MS SQL </w:t>
+      </w:r>
+      <w:proofErr w:type="gramStart"/>
+      <w:r>
+        <w:t>Server</w:t>
+      </w:r>
+      <w:proofErr w:type="gramEnd"/>
+      <w:r>
+        <w:t xml:space="preserve"> mint központi adatbázis-kezelő rendszer</w:t>
+      </w:r>
+    </w:p>
+    <w:p>
+      <w:pPr>
+        <w:pStyle w:val="Firstparagraph"/>
+      </w:pPr>
+      <w:r>
+        <w:t xml:space="preserve">Az alkalmazás adatainak tárolásához az </w:t>
+      </w:r>
+      <w:proofErr w:type="spellStart"/>
+      <w:r>
+        <w:rPr>
+          <w:b/>
+          <w:bCs/>
+        </w:rPr>
+        <w:t>MS</w:t>
+      </w:r>
+      <w:r>
+        <w:t>adatbázist</w:t>
+      </w:r>
+      <w:proofErr w:type="spellEnd"/>
+      <w:r>
+        <w:t xml:space="preserve"> használtam, mivel egy stabil, gyors és nagyvállalati környezetben is bevált technológiáról van szó. A projekt során különösen fontos volt számomra, hogy egy olyan rendszert válasszak, amely hosszú távon is jól bírja a terhelést, és később is könnyen bővíthető. Az SQL Server pontosan ezt nyújtja: modern funkciókat, magas rendelkezésre állást és szoros integrációt a .NET ökoszisztémával.</w:t>
+      </w:r>
+    </w:p>
+    <w:p>
+      <w:pPr>
+        <w:pStyle w:val="Cmsor3"/>
+      </w:pPr>
+      <w:r>
+        <w:t>Skálázhatóság</w:t>
+      </w:r>
+    </w:p>
+    <w:p>
+      <w:pPr>
+        <w:pStyle w:val="NormlWeb"/>
+      </w:pPr>
+      <w:r>
+        <w:t xml:space="preserve">Az MS SQL Server egyik legnagyobb előnye a kiváló skálázhatóság. A 2025-ös verziót úgy tervezték, hogy gond nélkül kezeljen egészen kis, egygépes alkalmazásoktól kezdve a hatalmas, felhőalapú, több </w:t>
+      </w:r>
+      <w:proofErr w:type="spellStart"/>
+      <w:r>
+        <w:t>terabájtos</w:t>
+      </w:r>
+      <w:proofErr w:type="spellEnd"/>
+      <w:r>
+        <w:t xml:space="preserve"> rendszerekig mindent. Ez a projekt szempontjából azért volt fontos, mert egy egészségügyi jellegű alkalmazásnál a felhasználók és az adatok száma idővel jelentősen nőhet.</w:t>
+      </w:r>
+    </w:p>
+    <w:p>
+      <w:pPr>
+        <w:pStyle w:val="NormlWeb"/>
+      </w:pPr>
+      <w:r>
+        <w:t xml:space="preserve">Az SQL Server támogatja a </w:t>
+      </w:r>
+      <w:r>
+        <w:rPr>
+          <w:rStyle w:val="Kiemels2"/>
+          <w:rFonts w:eastAsiaTheme="majorEastAsia"/>
+        </w:rPr>
+        <w:t>függőleges és vízszintes skálázást</w:t>
+      </w:r>
+      <w:r>
+        <w:t xml:space="preserve">, így akár egyre erősebb hardverre költöztetem, akár felhős környezetben több példányra osztom a terhelést, a rendszer gond nélkül követi az igényeket. A modern verziók szorosan integrálódnak a </w:t>
+      </w:r>
+      <w:r>
+        <w:rPr>
+          <w:rStyle w:val="Kiemels2"/>
+          <w:rFonts w:eastAsiaTheme="majorEastAsia"/>
+        </w:rPr>
+        <w:t xml:space="preserve">Microsoft </w:t>
+      </w:r>
+      <w:proofErr w:type="spellStart"/>
+      <w:r>
+        <w:rPr>
+          <w:rStyle w:val="Kiemels2"/>
+          <w:rFonts w:eastAsiaTheme="majorEastAsia"/>
+        </w:rPr>
+        <w:t>Azure</w:t>
+      </w:r>
+      <w:proofErr w:type="spellEnd"/>
+      <w:r>
+        <w:t xml:space="preserve"> platformmal és a </w:t>
+      </w:r>
+      <w:r>
+        <w:rPr>
+          <w:rStyle w:val="Kiemels2"/>
+          <w:rFonts w:eastAsiaTheme="majorEastAsia"/>
+        </w:rPr>
+        <w:t xml:space="preserve">Microsoft </w:t>
+      </w:r>
+      <w:proofErr w:type="spellStart"/>
+      <w:r>
+        <w:rPr>
+          <w:rStyle w:val="Kiemels2"/>
+          <w:rFonts w:eastAsiaTheme="majorEastAsia"/>
+        </w:rPr>
+        <w:t>Fabric</w:t>
+      </w:r>
+      <w:proofErr w:type="spellEnd"/>
+      <w:r>
+        <w:t xml:space="preserve"> infrastruktúrával, így akár valós idejű adatfolyamok és nagy volumenű analitikai feldolgozások is megoldhatók.</w:t>
+      </w:r>
+    </w:p>
+    <w:p>
+      <w:pPr>
+        <w:pStyle w:val="NormlWeb"/>
+      </w:pPr>
+      <w:r>
+        <w:t xml:space="preserve">Ezen kívül olyan funkciók is rendelkezésre állnak, mint a </w:t>
+      </w:r>
+      <w:proofErr w:type="spellStart"/>
+      <w:r>
+        <w:rPr>
+          <w:rStyle w:val="Kiemels2"/>
+          <w:rFonts w:eastAsiaTheme="majorEastAsia"/>
+        </w:rPr>
+        <w:t>klaszterezés</w:t>
+      </w:r>
+      <w:proofErr w:type="spellEnd"/>
+      <w:r>
+        <w:t xml:space="preserve">, az </w:t>
+      </w:r>
+      <w:r>
+        <w:rPr>
+          <w:rStyle w:val="Kiemels2"/>
+          <w:rFonts w:eastAsiaTheme="majorEastAsia"/>
+        </w:rPr>
+        <w:t>automatikus terheléselosztás</w:t>
+      </w:r>
+      <w:r>
+        <w:t xml:space="preserve"> és a </w:t>
+      </w:r>
+      <w:r>
+        <w:rPr>
+          <w:rStyle w:val="Kiemels2"/>
+          <w:rFonts w:eastAsiaTheme="majorEastAsia"/>
+        </w:rPr>
+        <w:t>dinamikus erőforrás-gazdálkodás</w:t>
+      </w:r>
+      <w:r>
+        <w:t xml:space="preserve">, amelyek biztosítják, hogy nagyobb terhelés mellett is jól </w:t>
+      </w:r>
+      <w:proofErr w:type="spellStart"/>
+      <w:r>
+        <w:t>működjön</w:t>
+      </w:r>
+      <w:proofErr w:type="spellEnd"/>
+      <w:r>
+        <w:t xml:space="preserve"> a rendszer, és ne legyen érezhető teljesítménycsökkenés.</w:t>
+      </w:r>
+    </w:p>
+    <w:p>
+      <w:pPr>
+        <w:spacing w:after="160" w:line="259" w:lineRule="auto"/>
+        <w:ind w:firstLine="0"/>
+        <w:jc w:val="left"/>
+        <w:rPr>
+          <w:rFonts w:eastAsia="Times New Roman" w:cs="Times New Roman"/>
+          <w:szCs w:val="24"/>
+          <w:lang w:eastAsia="hu-HU"/>
+        </w:rPr>
+      </w:pPr>
+      <w:r>
+        <w:br w:type="page"/>
+      </w:r>
+    </w:p>
+    <w:p>
+      <w:pPr>
+        <w:pStyle w:val="Cmsor3"/>
+      </w:pPr>
+      <w:r>
+        <w:lastRenderedPageBreak/>
+        <w:t>Gyorsaság (Teljesítmény)</w:t>
+      </w:r>
+    </w:p>
+    <w:p>
+      <w:pPr>
+        <w:pStyle w:val="Firstparagraph"/>
+      </w:pPr>
+      <w:r>
+        <w:t xml:space="preserve">Az SQL Server teljesítményben is nagyon erős, köszönhetően a modern optimalizációs technikáknak. A rendszer fejlett lekérdezés-optimalizálást, </w:t>
+      </w:r>
+      <w:proofErr w:type="spellStart"/>
+      <w:r>
+        <w:t>columnstore</w:t>
+      </w:r>
+      <w:proofErr w:type="spellEnd"/>
+      <w:r>
+        <w:t xml:space="preserve"> indexeket, batch feldolgozást, intelligens lekérdezés-optimalizálást (IQP) és in-</w:t>
+      </w:r>
+      <w:proofErr w:type="spellStart"/>
+      <w:r>
+        <w:t>memory</w:t>
+      </w:r>
+      <w:proofErr w:type="spellEnd"/>
+      <w:r>
+        <w:t xml:space="preserve"> technológiákat használ. Ezek mind hozzájárultak ahhoz, hogy a lekérdezések gyorsan fussanak, még nagy terhelés esetén is.</w:t>
+      </w:r>
+    </w:p>
+    <w:p>
+      <w:pPr>
+        <w:pStyle w:val="Firstparagraph"/>
+      </w:pPr>
+      <w:r>
+        <w:t>A legújabb tesztek alapján például:</w:t>
+      </w:r>
+    </w:p>
+    <w:p>
+      <w:pPr>
+        <w:pStyle w:val="Firstparagraph"/>
+        <w:numPr>
+          <w:ilvl w:val="0"/>
+          <w:numId w:val="24"/>
+        </w:numPr>
+      </w:pPr>
+      <w:r>
+        <w:t>bizonyos jelentések akár 50–55%-kal gyorsabban elkészülnek,</w:t>
+      </w:r>
+    </w:p>
+    <w:p>
+      <w:pPr>
+        <w:pStyle w:val="Firstparagraph"/>
+        <w:numPr>
+          <w:ilvl w:val="0"/>
+          <w:numId w:val="24"/>
+        </w:numPr>
+      </w:pPr>
+      <w:r>
+        <w:t>a nagy adatfeldolgozási műveletek pedig akár 90%-kal gyorsabbak lehetnek.</w:t>
+      </w:r>
+    </w:p>
+    <w:p>
+      <w:pPr>
+        <w:pStyle w:val="Firstparagraph"/>
+      </w:pPr>
+      <w:r>
+        <w:t>Ez egy olyan alkalmazásnál, amelyet egyszerre több páciens és orvos használ, kifejezetten előnyös volt. A gyors adat-elérésnek köszönhetően az időpontfoglalások, lekérdezések, adatmódosítások mind gördülékenyen történtek.</w:t>
+      </w:r>
+    </w:p>
+    <w:p>
+      <w:pPr>
+        <w:pStyle w:val="Firstparagraph"/>
+      </w:pPr>
+      <w:r>
+        <w:t>A 2025-ös verzió ráadásul támogatja a valós idejű adatfeldolgozást, így a rendszer gyakorlatilag azonnal reagál az új információkra. Ez nagyon hasznos volt például az emlékeztetők vagy időpontok változásainak gyors lekövetésében.</w:t>
+      </w:r>
+    </w:p>
+    <w:p>
+      <w:pPr>
+        <w:pStyle w:val="Cmsor3"/>
+      </w:pPr>
+      <w:r>
+        <w:t>Megbízhatóság</w:t>
+      </w:r>
+    </w:p>
+    <w:p>
+      <w:pPr>
+        <w:pStyle w:val="Firstparagraph"/>
+      </w:pPr>
+      <w:r>
+        <w:t>A megbízhatóság különösen fontos szempont volt számomra, mivel a rendszer egészségügyi adatokkal dolgozik. Az MS SQL Server ezen a téren is kiemelkedő. Olyan funkciókat biztosít, mint az:</w:t>
+      </w:r>
+    </w:p>
+    <w:p>
+      <w:pPr>
+        <w:pStyle w:val="Firstparagraph"/>
+        <w:numPr>
+          <w:ilvl w:val="0"/>
+          <w:numId w:val="25"/>
+        </w:numPr>
+      </w:pPr>
+      <w:proofErr w:type="spellStart"/>
+      <w:r>
+        <w:rPr>
+          <w:b/>
+          <w:bCs/>
+        </w:rPr>
+        <w:t>Always</w:t>
+      </w:r>
+      <w:proofErr w:type="spellEnd"/>
+      <w:r>
+        <w:rPr>
+          <w:b/>
+          <w:bCs/>
+        </w:rPr>
+        <w:t xml:space="preserve"> </w:t>
+      </w:r>
+      <w:proofErr w:type="spellStart"/>
+      <w:r>
+        <w:rPr>
+          <w:b/>
+          <w:bCs/>
+        </w:rPr>
+        <w:t>On</w:t>
+      </w:r>
+      <w:proofErr w:type="spellEnd"/>
+      <w:r>
+        <w:rPr>
+          <w:b/>
+          <w:bCs/>
+        </w:rPr>
+        <w:t xml:space="preserve"> </w:t>
+      </w:r>
+      <w:proofErr w:type="spellStart"/>
+      <w:r>
+        <w:rPr>
+          <w:b/>
+          <w:bCs/>
+        </w:rPr>
+        <w:t>Availability</w:t>
+      </w:r>
+      <w:proofErr w:type="spellEnd"/>
+      <w:r>
+        <w:rPr>
+          <w:b/>
+          <w:bCs/>
+        </w:rPr>
+        <w:t xml:space="preserve"> </w:t>
+      </w:r>
+      <w:proofErr w:type="spellStart"/>
+      <w:r>
+        <w:rPr>
+          <w:b/>
+          <w:bCs/>
+        </w:rPr>
+        <w:t>Groups</w:t>
+      </w:r>
+      <w:proofErr w:type="spellEnd"/>
+      <w:r>
+        <w:t>,</w:t>
+      </w:r>
+    </w:p>
+    <w:p>
+      <w:pPr>
+        <w:pStyle w:val="Firstparagraph"/>
+        <w:numPr>
+          <w:ilvl w:val="0"/>
+          <w:numId w:val="25"/>
+        </w:numPr>
+      </w:pPr>
+      <w:r>
+        <w:rPr>
+          <w:b/>
+          <w:bCs/>
+        </w:rPr>
+        <w:t xml:space="preserve">automatikus </w:t>
+      </w:r>
+      <w:proofErr w:type="spellStart"/>
+      <w:r>
+        <w:rPr>
+          <w:b/>
+          <w:bCs/>
+        </w:rPr>
+        <w:t>failover</w:t>
+      </w:r>
+      <w:proofErr w:type="spellEnd"/>
+      <w:r>
+        <w:rPr>
+          <w:b/>
+          <w:bCs/>
+        </w:rPr>
+        <w:t xml:space="preserve"> klaszterek</w:t>
+      </w:r>
+      <w:r>
+        <w:t>,</w:t>
+      </w:r>
+    </w:p>
+    <w:p>
+      <w:pPr>
+        <w:pStyle w:val="Firstparagraph"/>
+        <w:numPr>
+          <w:ilvl w:val="0"/>
+          <w:numId w:val="25"/>
+        </w:numPr>
+      </w:pPr>
+      <w:r>
+        <w:rPr>
+          <w:b/>
+          <w:bCs/>
+        </w:rPr>
+        <w:t>naplóalapú helyreállítás</w:t>
+      </w:r>
+      <w:r>
+        <w:t>,</w:t>
+      </w:r>
+    </w:p>
+    <w:p>
+      <w:pPr>
+        <w:pStyle w:val="Firstparagraph"/>
+        <w:numPr>
+          <w:ilvl w:val="0"/>
+          <w:numId w:val="25"/>
+        </w:numPr>
+      </w:pPr>
+      <w:r>
+        <w:rPr>
+          <w:b/>
+          <w:bCs/>
+        </w:rPr>
+        <w:t>adatvédelmi és integritási ellenőrzések</w:t>
+      </w:r>
+      <w:r>
+        <w:t>,</w:t>
+      </w:r>
+    </w:p>
+    <w:p>
+      <w:pPr>
+        <w:pStyle w:val="Firstparagraph"/>
+        <w:numPr>
+          <w:ilvl w:val="0"/>
+          <w:numId w:val="25"/>
+        </w:numPr>
+      </w:pPr>
+      <w:r>
+        <w:rPr>
+          <w:b/>
+          <w:bCs/>
+        </w:rPr>
+        <w:t>önjavító mechanizmusok</w:t>
+      </w:r>
+      <w:r>
+        <w:t>,</w:t>
+      </w:r>
+    </w:p>
+    <w:p>
+      <w:pPr>
+        <w:pStyle w:val="Firstparagraph"/>
+        <w:numPr>
+          <w:ilvl w:val="0"/>
+          <w:numId w:val="25"/>
+        </w:numPr>
+      </w:pPr>
+      <w:r>
+        <w:t xml:space="preserve">és az </w:t>
+      </w:r>
+      <w:r>
+        <w:rPr>
+          <w:b/>
+          <w:bCs/>
+        </w:rPr>
+        <w:t>automatikus index- és teljesítményhangolás</w:t>
+      </w:r>
+      <w:r>
+        <w:t>.</w:t>
+      </w:r>
+    </w:p>
+    <w:p>
+      <w:pPr>
+        <w:pStyle w:val="Firstparagraph"/>
+      </w:pPr>
+      <w:r>
+        <w:t>Ezek együtt azt eredményezik, hogy a rendszer szinte folyamatos rendelkezésre állást biztosít, és még hiba esetén sem veszíti el az adatokat. A modern SQL Server verziók “önmagukat optimalizálják”, például képesek automatikusan újraépíteni indexeket, kijavítani bizonyos hibákat és dinamikusan kezelni az erőforrásokat.</w:t>
+      </w:r>
+    </w:p>
+    <w:p>
+      <w:pPr>
+        <w:pStyle w:val="Firstparagraph"/>
+      </w:pPr>
+      <w:r>
+        <w:lastRenderedPageBreak/>
+        <w:t>Mivel az alkalmazás kritikus adatokkal dolgozik, fontos volt, hogy az adatbázis-kezelő egy esetleges hiba esetén is magától helyre tudjon állni, illetve garantálja az adatok sértetlenségét. Az SQL Server ezen a téren is teljes mértékben bevált.</w:t>
+      </w:r>
+    </w:p>
+    <w:p>
+      <w:pPr>
+        <w:ind w:firstLine="0"/>
+      </w:pPr>
+    </w:p>
+    <w:p>
+      <w:pPr>
+        <w:spacing w:after="160" w:line="259" w:lineRule="auto"/>
+        <w:ind w:firstLine="0"/>
+        <w:jc w:val="left"/>
+      </w:pPr>
+      <w:r>
+        <w:br w:type="page"/>
+      </w:r>
+    </w:p>
+    <w:p>
+      <w:pPr>
+        <w:pStyle w:val="Cmsor1"/>
+      </w:pPr>
+      <w:r>
+        <w:lastRenderedPageBreak/>
+        <w:t>Piackutatás</w:t>
+      </w:r>
+    </w:p>
+    <w:p>
+      <w:pPr>
+        <w:pStyle w:val="Firstparagraph"/>
+      </w:pPr>
+      <w:r>
+        <w:t xml:space="preserve">A szakdolgozat elkészítésének nagyon fontos feladata volt az, hogy felmérjem a piacon már </w:t>
+      </w:r>
+      <w:proofErr w:type="spellStart"/>
+      <w:r>
+        <w:t>jelenléve</w:t>
+      </w:r>
+      <w:proofErr w:type="spellEnd"/>
+      <w:r>
+        <w:t xml:space="preserve">, hasonló </w:t>
+      </w:r>
+      <w:proofErr w:type="spellStart"/>
+      <w:r>
+        <w:t>típúsú</w:t>
+      </w:r>
+      <w:proofErr w:type="spellEnd"/>
+      <w:r>
+        <w:t xml:space="preserve"> szoftvertermékeket, és ezeket </w:t>
+      </w:r>
+      <w:proofErr w:type="spellStart"/>
+      <w:r>
+        <w:t>felhaszáljam</w:t>
+      </w:r>
+      <w:proofErr w:type="spellEnd"/>
+      <w:r>
+        <w:t xml:space="preserve"> az én </w:t>
+      </w:r>
+      <w:proofErr w:type="spellStart"/>
+      <w:r>
+        <w:t>alkamazásom</w:t>
+      </w:r>
+      <w:proofErr w:type="spellEnd"/>
+      <w:r>
+        <w:t xml:space="preserve"> tervezésekor</w:t>
+      </w:r>
+    </w:p>
+    <w:p>
+      <w:pPr>
+        <w:pStyle w:val="Cmsor3"/>
+      </w:pPr>
+      <w:proofErr w:type="spellStart"/>
+      <w:r>
+        <w:t>Journl</w:t>
+      </w:r>
+      <w:proofErr w:type="spellEnd"/>
+    </w:p>
+    <w:p>
+      <w:pPr>
+        <w:pStyle w:val="Firstparagraph"/>
+      </w:pPr>
+      <w:r>
+        <w:t xml:space="preserve">A </w:t>
+      </w:r>
+      <w:proofErr w:type="spellStart"/>
+      <w:r>
+        <w:t>Journl</w:t>
+      </w:r>
+      <w:proofErr w:type="spellEnd"/>
+      <w:r>
+        <w:t xml:space="preserve"> egy dán fejlesztésű telemedicina-platform, amelynek fő célja a beteg által jelentett állapotadatok (PRO) gyűjtése és a hatékony orvos–beteg kommunikáció támogatása. A rendszer elsősorban kisebb dániai pilotprojektekben bizonyított, de koncepciója jól adaptálható más európai egészségügyi környezetekben is.</w:t>
+      </w:r>
+    </w:p>
+    <w:p>
+      <w:pPr>
+        <w:pStyle w:val="Firstparagraph"/>
+        <w:numPr>
+          <w:ilvl w:val="0"/>
+          <w:numId w:val="26"/>
+        </w:numPr>
+      </w:pPr>
+      <w:r>
+        <w:t>Fő funkciók</w:t>
+      </w:r>
+    </w:p>
+    <w:p>
+      <w:pPr>
+        <w:pStyle w:val="Firstparagraph"/>
+        <w:numPr>
+          <w:ilvl w:val="0"/>
+          <w:numId w:val="26"/>
+        </w:numPr>
+      </w:pPr>
+      <w:r>
+        <w:t>Betegnapló és állapotkövetés: A páciensek naplózhatják tüneteiket, gyógyszerszedésüket, állapotváltozásaikat, valamint kitölthetnek kérdőíveket. A rendszer ezekből automatikus jelentéseket és grafikus elemzéseket generál az orvosok számára.</w:t>
+      </w:r>
+    </w:p>
+    <w:p>
+      <w:pPr>
+        <w:pStyle w:val="Firstparagraph"/>
+        <w:numPr>
+          <w:ilvl w:val="0"/>
+          <w:numId w:val="26"/>
+        </w:numPr>
+      </w:pPr>
+      <w:r>
+        <w:t>Gyógyszeres emlékeztetők: Személyre szabható értesítések, adagolási napló és gyógyszerkövetés, amelyek segítik a terápiás előírások pontos betartását.</w:t>
+      </w:r>
+    </w:p>
+    <w:p>
+      <w:pPr>
+        <w:pStyle w:val="Firstparagraph"/>
+        <w:numPr>
+          <w:ilvl w:val="0"/>
+          <w:numId w:val="26"/>
+        </w:numPr>
+      </w:pPr>
+      <w:r>
+        <w:t>Időpontfoglalás: Integrált modul a vizsgálati időpontok foglalására, módosítására és nyomon követésére.</w:t>
+      </w:r>
+    </w:p>
+    <w:p>
+      <w:pPr>
+        <w:pStyle w:val="Firstparagraph"/>
+        <w:numPr>
+          <w:ilvl w:val="0"/>
+          <w:numId w:val="26"/>
+        </w:numPr>
+      </w:pPr>
+      <w:r>
+        <w:t>Kétirányú kommunikáció: Valós idejű üzenetküldés a páciens és az orvos között, ami csökkenti a felesleges személyes konzultációkat és gyorsabb visszacsatolást biztosít.</w:t>
+      </w:r>
+    </w:p>
+    <w:p>
+      <w:pPr>
+        <w:pStyle w:val="Firstparagraph"/>
+        <w:numPr>
+          <w:ilvl w:val="0"/>
+          <w:numId w:val="26"/>
+        </w:numPr>
+      </w:pPr>
+      <w:r>
+        <w:t xml:space="preserve">Egészségügyi jelentések: Részletes analitikai áttekintések a beteg állapotának alakulásáról, a terápiás hatékonyságról és a </w:t>
+      </w:r>
+      <w:proofErr w:type="spellStart"/>
+      <w:r>
+        <w:t>gyógyszeradherenciáról</w:t>
+      </w:r>
+      <w:proofErr w:type="spellEnd"/>
+      <w:r>
+        <w:t>.</w:t>
+      </w:r>
+    </w:p>
+    <w:p>
+      <w:pPr>
+        <w:pStyle w:val="Firstparagraph"/>
+        <w:numPr>
+          <w:ilvl w:val="0"/>
+          <w:numId w:val="26"/>
+        </w:numPr>
+      </w:pPr>
+      <w:r>
+        <w:t>Integrációs lehetőségek: FHIR/HL7 alapú kompatibilitás, kórházi rendszerekkel való összekapcsolhatóság, GDPR-megfelelés.</w:t>
+      </w:r>
+    </w:p>
+    <w:p>
+      <w:pPr>
+        <w:pStyle w:val="Firstparagraph"/>
+      </w:pPr>
+    </w:p>
+    <w:p>
+      <w:pPr>
+        <w:pStyle w:val="Cmsor3"/>
+        <w:pageBreakBefore/>
+        <w:numPr>
+          <w:ilvl w:val="0"/>
+          <w:numId w:val="0"/>
+        </w:numPr>
+      </w:pPr>
+    </w:p>
     <w:sectPr>
       <w:headerReference w:type="default" r:id="rId13"/>
       <w:pgSz w:w="11906" w:h="16838" w:code="9"/>
@@ -3247,7 +3856,7 @@
   <w:abstractNum w:abstractNumId="0" w15:restartNumberingAfterBreak="0">
     <w:nsid w:val="1C6A328F"/>
     <w:multiLevelType w:val="hybridMultilevel"/>
-    <w:tmpl w:val="30C42B28"/>
+    <w:tmpl w:val="A96C14AE"/>
     <w:lvl w:ilvl="0" w:tplc="6C4E8D32">
       <w:start w:val="1"/>
       <w:numFmt w:val="decimal"/>
@@ -3334,6 +3943,268 @@
     </w:lvl>
   </w:abstractNum>
   <w:abstractNum w:abstractNumId="1" w15:restartNumberingAfterBreak="0">
+    <w:nsid w:val="354C73A8"/>
+    <w:multiLevelType w:val="hybridMultilevel"/>
+    <w:tmpl w:val="86085494"/>
+    <w:lvl w:ilvl="0" w:tplc="040E0001">
+      <w:start w:val="1"/>
+      <w:numFmt w:val="bullet"/>
+      <w:lvlText w:val=""/>
+      <w:lvlJc w:val="left"/>
+      <w:pPr>
+        <w:ind w:left="720" w:hanging="360"/>
+      </w:pPr>
+      <w:rPr>
+        <w:rFonts w:ascii="Symbol" w:hAnsi="Symbol" w:hint="default"/>
+      </w:rPr>
+    </w:lvl>
+    <w:lvl w:ilvl="1" w:tplc="040E0003" w:tentative="1">
+      <w:start w:val="1"/>
+      <w:numFmt w:val="bullet"/>
+      <w:lvlText w:val="o"/>
+      <w:lvlJc w:val="left"/>
+      <w:pPr>
+        <w:ind w:left="1440" w:hanging="360"/>
+      </w:pPr>
+      <w:rPr>
+        <w:rFonts w:ascii="Courier New" w:hAnsi="Courier New" w:cs="Courier New" w:hint="default"/>
+      </w:rPr>
+    </w:lvl>
+    <w:lvl w:ilvl="2" w:tplc="040E0005" w:tentative="1">
+      <w:start w:val="1"/>
+      <w:numFmt w:val="bullet"/>
+      <w:lvlText w:val=""/>
+      <w:lvlJc w:val="left"/>
+      <w:pPr>
+        <w:ind w:left="2160" w:hanging="360"/>
+      </w:pPr>
+      <w:rPr>
+        <w:rFonts w:ascii="Wingdings" w:hAnsi="Wingdings" w:hint="default"/>
+      </w:rPr>
+    </w:lvl>
+    <w:lvl w:ilvl="3" w:tplc="040E0001" w:tentative="1">
+      <w:start w:val="1"/>
+      <w:numFmt w:val="bullet"/>
+      <w:lvlText w:val=""/>
+      <w:lvlJc w:val="left"/>
+      <w:pPr>
+        <w:ind w:left="2880" w:hanging="360"/>
+      </w:pPr>
+      <w:rPr>
+        <w:rFonts w:ascii="Symbol" w:hAnsi="Symbol" w:hint="default"/>
+      </w:rPr>
+    </w:lvl>
+    <w:lvl w:ilvl="4" w:tplc="040E0003" w:tentative="1">
+      <w:start w:val="1"/>
+      <w:numFmt w:val="bullet"/>
+      <w:lvlText w:val="o"/>
+      <w:lvlJc w:val="left"/>
+      <w:pPr>
+        <w:ind w:left="3600" w:hanging="360"/>
+      </w:pPr>
+      <w:rPr>
+        <w:rFonts w:ascii="Courier New" w:hAnsi="Courier New" w:cs="Courier New" w:hint="default"/>
+      </w:rPr>
+    </w:lvl>
+    <w:lvl w:ilvl="5" w:tplc="040E0005" w:tentative="1">
+      <w:start w:val="1"/>
+      <w:numFmt w:val="bullet"/>
+      <w:lvlText w:val=""/>
+      <w:lvlJc w:val="left"/>
+      <w:pPr>
+        <w:ind w:left="4320" w:hanging="360"/>
+      </w:pPr>
+      <w:rPr>
+        <w:rFonts w:ascii="Wingdings" w:hAnsi="Wingdings" w:hint="default"/>
+      </w:rPr>
+    </w:lvl>
+    <w:lvl w:ilvl="6" w:tplc="040E0001" w:tentative="1">
+      <w:start w:val="1"/>
+      <w:numFmt w:val="bullet"/>
+      <w:lvlText w:val=""/>
+      <w:lvlJc w:val="left"/>
+      <w:pPr>
+        <w:ind w:left="5040" w:hanging="360"/>
+      </w:pPr>
+      <w:rPr>
+        <w:rFonts w:ascii="Symbol" w:hAnsi="Symbol" w:hint="default"/>
+      </w:rPr>
+    </w:lvl>
+    <w:lvl w:ilvl="7" w:tplc="040E0003" w:tentative="1">
+      <w:start w:val="1"/>
+      <w:numFmt w:val="bullet"/>
+      <w:lvlText w:val="o"/>
+      <w:lvlJc w:val="left"/>
+      <w:pPr>
+        <w:ind w:left="5760" w:hanging="360"/>
+      </w:pPr>
+      <w:rPr>
+        <w:rFonts w:ascii="Courier New" w:hAnsi="Courier New" w:cs="Courier New" w:hint="default"/>
+      </w:rPr>
+    </w:lvl>
+    <w:lvl w:ilvl="8" w:tplc="040E0005" w:tentative="1">
+      <w:start w:val="1"/>
+      <w:numFmt w:val="bullet"/>
+      <w:lvlText w:val=""/>
+      <w:lvlJc w:val="left"/>
+      <w:pPr>
+        <w:ind w:left="6480" w:hanging="360"/>
+      </w:pPr>
+      <w:rPr>
+        <w:rFonts w:ascii="Wingdings" w:hAnsi="Wingdings" w:hint="default"/>
+      </w:rPr>
+    </w:lvl>
+  </w:abstractNum>
+  <w:abstractNum w:abstractNumId="2" w15:restartNumberingAfterBreak="0">
+    <w:nsid w:val="394850D0"/>
+    <w:multiLevelType w:val="multilevel"/>
+    <w:tmpl w:val="0B08B00C"/>
+    <w:lvl w:ilvl="0">
+      <w:start w:val="1"/>
+      <w:numFmt w:val="bullet"/>
+      <w:lvlText w:val=""/>
+      <w:lvlJc w:val="left"/>
+      <w:pPr>
+        <w:tabs>
+          <w:tab w:val="num" w:pos="720"/>
+        </w:tabs>
+        <w:ind w:left="720" w:hanging="360"/>
+      </w:pPr>
+      <w:rPr>
+        <w:rFonts w:ascii="Symbol" w:hAnsi="Symbol" w:hint="default"/>
+        <w:sz w:val="20"/>
+      </w:rPr>
+    </w:lvl>
+    <w:lvl w:ilvl="1" w:tentative="1">
+      <w:start w:val="1"/>
+      <w:numFmt w:val="bullet"/>
+      <w:lvlText w:val="o"/>
+      <w:lvlJc w:val="left"/>
+      <w:pPr>
+        <w:tabs>
+          <w:tab w:val="num" w:pos="1440"/>
+        </w:tabs>
+        <w:ind w:left="1440" w:hanging="360"/>
+      </w:pPr>
+      <w:rPr>
+        <w:rFonts w:ascii="Courier New" w:hAnsi="Courier New" w:hint="default"/>
+        <w:sz w:val="20"/>
+      </w:rPr>
+    </w:lvl>
+    <w:lvl w:ilvl="2" w:tentative="1">
+      <w:start w:val="1"/>
+      <w:numFmt w:val="bullet"/>
+      <w:lvlText w:val=""/>
+      <w:lvlJc w:val="left"/>
+      <w:pPr>
+        <w:tabs>
+          <w:tab w:val="num" w:pos="2160"/>
+        </w:tabs>
+        <w:ind w:left="2160" w:hanging="360"/>
+      </w:pPr>
+      <w:rPr>
+        <w:rFonts w:ascii="Wingdings" w:hAnsi="Wingdings" w:hint="default"/>
+        <w:sz w:val="20"/>
+      </w:rPr>
+    </w:lvl>
+    <w:lvl w:ilvl="3" w:tentative="1">
+      <w:start w:val="1"/>
+      <w:numFmt w:val="bullet"/>
+      <w:lvlText w:val=""/>
+      <w:lvlJc w:val="left"/>
+      <w:pPr>
+        <w:tabs>
+          <w:tab w:val="num" w:pos="2880"/>
+        </w:tabs>
+        <w:ind w:left="2880" w:hanging="360"/>
+      </w:pPr>
+      <w:rPr>
+        <w:rFonts w:ascii="Wingdings" w:hAnsi="Wingdings" w:hint="default"/>
+        <w:sz w:val="20"/>
+      </w:rPr>
+    </w:lvl>
+    <w:lvl w:ilvl="4" w:tentative="1">
+      <w:start w:val="1"/>
+      <w:numFmt w:val="bullet"/>
+      <w:lvlText w:val=""/>
+      <w:lvlJc w:val="left"/>
+      <w:pPr>
+        <w:tabs>
+          <w:tab w:val="num" w:pos="3600"/>
+        </w:tabs>
+        <w:ind w:left="3600" w:hanging="360"/>
+      </w:pPr>
+      <w:rPr>
+        <w:rFonts w:ascii="Wingdings" w:hAnsi="Wingdings" w:hint="default"/>
+        <w:sz w:val="20"/>
+      </w:rPr>
+    </w:lvl>
+    <w:lvl w:ilvl="5" w:tentative="1">
+      <w:start w:val="1"/>
+      <w:numFmt w:val="bullet"/>
+      <w:lvlText w:val=""/>
+      <w:lvlJc w:val="left"/>
+      <w:pPr>
+        <w:tabs>
+          <w:tab w:val="num" w:pos="4320"/>
+        </w:tabs>
+        <w:ind w:left="4320" w:hanging="360"/>
+      </w:pPr>
+      <w:rPr>
+        <w:rFonts w:ascii="Wingdings" w:hAnsi="Wingdings" w:hint="default"/>
+        <w:sz w:val="20"/>
+      </w:rPr>
+    </w:lvl>
+    <w:lvl w:ilvl="6" w:tentative="1">
+      <w:start w:val="1"/>
+      <w:numFmt w:val="bullet"/>
+      <w:lvlText w:val=""/>
+      <w:lvlJc w:val="left"/>
+      <w:pPr>
+        <w:tabs>
+          <w:tab w:val="num" w:pos="5040"/>
+        </w:tabs>
+        <w:ind w:left="5040" w:hanging="360"/>
+      </w:pPr>
+      <w:rPr>
+        <w:rFonts w:ascii="Wingdings" w:hAnsi="Wingdings" w:hint="default"/>
+        <w:sz w:val="20"/>
+      </w:rPr>
+    </w:lvl>
+    <w:lvl w:ilvl="7" w:tentative="1">
+      <w:start w:val="1"/>
+      <w:numFmt w:val="bullet"/>
+      <w:lvlText w:val=""/>
+      <w:lvlJc w:val="left"/>
+      <w:pPr>
+        <w:tabs>
+          <w:tab w:val="num" w:pos="5760"/>
+        </w:tabs>
+        <w:ind w:left="5760" w:hanging="360"/>
+      </w:pPr>
+      <w:rPr>
+        <w:rFonts w:ascii="Wingdings" w:hAnsi="Wingdings" w:hint="default"/>
+        <w:sz w:val="20"/>
+      </w:rPr>
+    </w:lvl>
+    <w:lvl w:ilvl="8" w:tentative="1">
+      <w:start w:val="1"/>
+      <w:numFmt w:val="bullet"/>
+      <w:lvlText w:val=""/>
+      <w:lvlJc w:val="left"/>
+      <w:pPr>
+        <w:tabs>
+          <w:tab w:val="num" w:pos="6480"/>
+        </w:tabs>
+        <w:ind w:left="6480" w:hanging="360"/>
+      </w:pPr>
+      <w:rPr>
+        <w:rFonts w:ascii="Wingdings" w:hAnsi="Wingdings" w:hint="default"/>
+        <w:sz w:val="20"/>
+      </w:rPr>
+    </w:lvl>
+  </w:abstractNum>
+  <w:abstractNum w:abstractNumId="3" w15:restartNumberingAfterBreak="0">
     <w:nsid w:val="48522291"/>
     <w:multiLevelType w:val="hybridMultilevel"/>
     <w:tmpl w:val="9A96F2E2"/>
@@ -3446,7 +4317,156 @@
       </w:rPr>
     </w:lvl>
   </w:abstractNum>
-  <w:abstractNum w:abstractNumId="2" w15:restartNumberingAfterBreak="0">
+  <w:abstractNum w:abstractNumId="4" w15:restartNumberingAfterBreak="0">
+    <w:nsid w:val="507B5616"/>
+    <w:multiLevelType w:val="multilevel"/>
+    <w:tmpl w:val="A4B8C24E"/>
+    <w:lvl w:ilvl="0">
+      <w:start w:val="1"/>
+      <w:numFmt w:val="bullet"/>
+      <w:lvlText w:val=""/>
+      <w:lvlJc w:val="left"/>
+      <w:pPr>
+        <w:tabs>
+          <w:tab w:val="num" w:pos="720"/>
+        </w:tabs>
+        <w:ind w:left="720" w:hanging="360"/>
+      </w:pPr>
+      <w:rPr>
+        <w:rFonts w:ascii="Symbol" w:hAnsi="Symbol" w:hint="default"/>
+        <w:sz w:val="20"/>
+      </w:rPr>
+    </w:lvl>
+    <w:lvl w:ilvl="1" w:tentative="1">
+      <w:start w:val="1"/>
+      <w:numFmt w:val="bullet"/>
+      <w:lvlText w:val="o"/>
+      <w:lvlJc w:val="left"/>
+      <w:pPr>
+        <w:tabs>
+          <w:tab w:val="num" w:pos="1440"/>
+        </w:tabs>
+        <w:ind w:left="1440" w:hanging="360"/>
+      </w:pPr>
+      <w:rPr>
+        <w:rFonts w:ascii="Courier New" w:hAnsi="Courier New" w:hint="default"/>
+        <w:sz w:val="20"/>
+      </w:rPr>
+    </w:lvl>
+    <w:lvl w:ilvl="2" w:tentative="1">
+      <w:start w:val="1"/>
+      <w:numFmt w:val="bullet"/>
+      <w:lvlText w:val=""/>
+      <w:lvlJc w:val="left"/>
+      <w:pPr>
+        <w:tabs>
+          <w:tab w:val="num" w:pos="2160"/>
+        </w:tabs>
+        <w:ind w:left="2160" w:hanging="360"/>
+      </w:pPr>
+      <w:rPr>
+        <w:rFonts w:ascii="Wingdings" w:hAnsi="Wingdings" w:hint="default"/>
+        <w:sz w:val="20"/>
+      </w:rPr>
+    </w:lvl>
+    <w:lvl w:ilvl="3" w:tentative="1">
+      <w:start w:val="1"/>
+      <w:numFmt w:val="bullet"/>
+      <w:lvlText w:val=""/>
+      <w:lvlJc w:val="left"/>
+      <w:pPr>
+        <w:tabs>
+          <w:tab w:val="num" w:pos="2880"/>
+        </w:tabs>
+        <w:ind w:left="2880" w:hanging="360"/>
+      </w:pPr>
+      <w:rPr>
+        <w:rFonts w:ascii="Wingdings" w:hAnsi="Wingdings" w:hint="default"/>
+        <w:sz w:val="20"/>
+      </w:rPr>
+    </w:lvl>
+    <w:lvl w:ilvl="4" w:tentative="1">
+      <w:start w:val="1"/>
+      <w:numFmt w:val="bullet"/>
+      <w:lvlText w:val=""/>
+      <w:lvlJc w:val="left"/>
+      <w:pPr>
+        <w:tabs>
+          <w:tab w:val="num" w:pos="3600"/>
+        </w:tabs>
+        <w:ind w:left="3600" w:hanging="360"/>
+      </w:pPr>
+      <w:rPr>
+        <w:rFonts w:ascii="Wingdings" w:hAnsi="Wingdings" w:hint="default"/>
+        <w:sz w:val="20"/>
+      </w:rPr>
+    </w:lvl>
+    <w:lvl w:ilvl="5" w:tentative="1">
+      <w:start w:val="1"/>
+      <w:numFmt w:val="bullet"/>
+      <w:lvlText w:val=""/>
+      <w:lvlJc w:val="left"/>
+      <w:pPr>
+        <w:tabs>
+          <w:tab w:val="num" w:pos="4320"/>
+        </w:tabs>
+        <w:ind w:left="4320" w:hanging="360"/>
+      </w:pPr>
+      <w:rPr>
+        <w:rFonts w:ascii="Wingdings" w:hAnsi="Wingdings" w:hint="default"/>
+        <w:sz w:val="20"/>
+      </w:rPr>
+    </w:lvl>
+    <w:lvl w:ilvl="6" w:tentative="1">
+      <w:start w:val="1"/>
+      <w:numFmt w:val="bullet"/>
+      <w:lvlText w:val=""/>
+      <w:lvlJc w:val="left"/>
+      <w:pPr>
+        <w:tabs>
+          <w:tab w:val="num" w:pos="5040"/>
+        </w:tabs>
+        <w:ind w:left="5040" w:hanging="360"/>
+      </w:pPr>
+      <w:rPr>
+        <w:rFonts w:ascii="Wingdings" w:hAnsi="Wingdings" w:hint="default"/>
+        <w:sz w:val="20"/>
+      </w:rPr>
+    </w:lvl>
+    <w:lvl w:ilvl="7" w:tentative="1">
+      <w:start w:val="1"/>
+      <w:numFmt w:val="bullet"/>
+      <w:lvlText w:val=""/>
+      <w:lvlJc w:val="left"/>
+      <w:pPr>
+        <w:tabs>
+          <w:tab w:val="num" w:pos="5760"/>
+        </w:tabs>
+        <w:ind w:left="5760" w:hanging="360"/>
+      </w:pPr>
+      <w:rPr>
+        <w:rFonts w:ascii="Wingdings" w:hAnsi="Wingdings" w:hint="default"/>
+        <w:sz w:val="20"/>
+      </w:rPr>
+    </w:lvl>
+    <w:lvl w:ilvl="8" w:tentative="1">
+      <w:start w:val="1"/>
+      <w:numFmt w:val="bullet"/>
+      <w:lvlText w:val=""/>
+      <w:lvlJc w:val="left"/>
+      <w:pPr>
+        <w:tabs>
+          <w:tab w:val="num" w:pos="6480"/>
+        </w:tabs>
+        <w:ind w:left="6480" w:hanging="360"/>
+      </w:pPr>
+      <w:rPr>
+        <w:rFonts w:ascii="Wingdings" w:hAnsi="Wingdings" w:hint="default"/>
+        <w:sz w:val="20"/>
+      </w:rPr>
+    </w:lvl>
+  </w:abstractNum>
+  <w:abstractNum w:abstractNumId="5" w15:restartNumberingAfterBreak="0">
     <w:nsid w:val="513178CE"/>
     <w:multiLevelType w:val="hybridMultilevel"/>
     <w:tmpl w:val="AC40A064"/>
@@ -3571,7 +4591,156 @@
       </w:rPr>
     </w:lvl>
   </w:abstractNum>
-  <w:abstractNum w:abstractNumId="3" w15:restartNumberingAfterBreak="0">
+  <w:abstractNum w:abstractNumId="6" w15:restartNumberingAfterBreak="0">
+    <w:nsid w:val="54A61ED9"/>
+    <w:multiLevelType w:val="multilevel"/>
+    <w:tmpl w:val="20527088"/>
+    <w:lvl w:ilvl="0">
+      <w:start w:val="1"/>
+      <w:numFmt w:val="bullet"/>
+      <w:lvlText w:val=""/>
+      <w:lvlJc w:val="left"/>
+      <w:pPr>
+        <w:tabs>
+          <w:tab w:val="num" w:pos="720"/>
+        </w:tabs>
+        <w:ind w:left="720" w:hanging="360"/>
+      </w:pPr>
+      <w:rPr>
+        <w:rFonts w:ascii="Symbol" w:hAnsi="Symbol" w:hint="default"/>
+        <w:sz w:val="20"/>
+      </w:rPr>
+    </w:lvl>
+    <w:lvl w:ilvl="1" w:tentative="1">
+      <w:start w:val="1"/>
+      <w:numFmt w:val="bullet"/>
+      <w:lvlText w:val="o"/>
+      <w:lvlJc w:val="left"/>
+      <w:pPr>
+        <w:tabs>
+          <w:tab w:val="num" w:pos="1440"/>
+        </w:tabs>
+        <w:ind w:left="1440" w:hanging="360"/>
+      </w:pPr>
+      <w:rPr>
+        <w:rFonts w:ascii="Courier New" w:hAnsi="Courier New" w:hint="default"/>
+        <w:sz w:val="20"/>
+      </w:rPr>
+    </w:lvl>
+    <w:lvl w:ilvl="2" w:tentative="1">
+      <w:start w:val="1"/>
+      <w:numFmt w:val="bullet"/>
+      <w:lvlText w:val=""/>
+      <w:lvlJc w:val="left"/>
+      <w:pPr>
+        <w:tabs>
+          <w:tab w:val="num" w:pos="2160"/>
+        </w:tabs>
+        <w:ind w:left="2160" w:hanging="360"/>
+      </w:pPr>
+      <w:rPr>
+        <w:rFonts w:ascii="Wingdings" w:hAnsi="Wingdings" w:hint="default"/>
+        <w:sz w:val="20"/>
+      </w:rPr>
+    </w:lvl>
+    <w:lvl w:ilvl="3" w:tentative="1">
+      <w:start w:val="1"/>
+      <w:numFmt w:val="bullet"/>
+      <w:lvlText w:val=""/>
+      <w:lvlJc w:val="left"/>
+      <w:pPr>
+        <w:tabs>
+          <w:tab w:val="num" w:pos="2880"/>
+        </w:tabs>
+        <w:ind w:left="2880" w:hanging="360"/>
+      </w:pPr>
+      <w:rPr>
+        <w:rFonts w:ascii="Wingdings" w:hAnsi="Wingdings" w:hint="default"/>
+        <w:sz w:val="20"/>
+      </w:rPr>
+    </w:lvl>
+    <w:lvl w:ilvl="4" w:tentative="1">
+      <w:start w:val="1"/>
+      <w:numFmt w:val="bullet"/>
+      <w:lvlText w:val=""/>
+      <w:lvlJc w:val="left"/>
+      <w:pPr>
+        <w:tabs>
+          <w:tab w:val="num" w:pos="3600"/>
+        </w:tabs>
+        <w:ind w:left="3600" w:hanging="360"/>
+      </w:pPr>
+      <w:rPr>
+        <w:rFonts w:ascii="Wingdings" w:hAnsi="Wingdings" w:hint="default"/>
+        <w:sz w:val="20"/>
+      </w:rPr>
+    </w:lvl>
+    <w:lvl w:ilvl="5" w:tentative="1">
+      <w:start w:val="1"/>
+      <w:numFmt w:val="bullet"/>
+      <w:lvlText w:val=""/>
+      <w:lvlJc w:val="left"/>
+      <w:pPr>
+        <w:tabs>
+          <w:tab w:val="num" w:pos="4320"/>
+        </w:tabs>
+        <w:ind w:left="4320" w:hanging="360"/>
+      </w:pPr>
+      <w:rPr>
+        <w:rFonts w:ascii="Wingdings" w:hAnsi="Wingdings" w:hint="default"/>
+        <w:sz w:val="20"/>
+      </w:rPr>
+    </w:lvl>
+    <w:lvl w:ilvl="6" w:tentative="1">
+      <w:start w:val="1"/>
+      <w:numFmt w:val="bullet"/>
+      <w:lvlText w:val=""/>
+      <w:lvlJc w:val="left"/>
+      <w:pPr>
+        <w:tabs>
+          <w:tab w:val="num" w:pos="5040"/>
+        </w:tabs>
+        <w:ind w:left="5040" w:hanging="360"/>
+      </w:pPr>
+      <w:rPr>
+        <w:rFonts w:ascii="Wingdings" w:hAnsi="Wingdings" w:hint="default"/>
+        <w:sz w:val="20"/>
+      </w:rPr>
+    </w:lvl>
+    <w:lvl w:ilvl="7" w:tentative="1">
+      <w:start w:val="1"/>
+      <w:numFmt w:val="bullet"/>
+      <w:lvlText w:val=""/>
+      <w:lvlJc w:val="left"/>
+      <w:pPr>
+        <w:tabs>
+          <w:tab w:val="num" w:pos="5760"/>
+        </w:tabs>
+        <w:ind w:left="5760" w:hanging="360"/>
+      </w:pPr>
+      <w:rPr>
+        <w:rFonts w:ascii="Wingdings" w:hAnsi="Wingdings" w:hint="default"/>
+        <w:sz w:val="20"/>
+      </w:rPr>
+    </w:lvl>
+    <w:lvl w:ilvl="8" w:tentative="1">
+      <w:start w:val="1"/>
+      <w:numFmt w:val="bullet"/>
+      <w:lvlText w:val=""/>
+      <w:lvlJc w:val="left"/>
+      <w:pPr>
+        <w:tabs>
+          <w:tab w:val="num" w:pos="6480"/>
+        </w:tabs>
+        <w:ind w:left="6480" w:hanging="360"/>
+      </w:pPr>
+      <w:rPr>
+        <w:rFonts w:ascii="Wingdings" w:hAnsi="Wingdings" w:hint="default"/>
+        <w:sz w:val="20"/>
+      </w:rPr>
+    </w:lvl>
+  </w:abstractNum>
+  <w:abstractNum w:abstractNumId="7" w15:restartNumberingAfterBreak="0">
     <w:nsid w:val="572C729E"/>
     <w:multiLevelType w:val="hybridMultilevel"/>
     <w:tmpl w:val="ADFAC132"/>
@@ -3684,7 +4853,120 @@
       </w:rPr>
     </w:lvl>
   </w:abstractNum>
-  <w:abstractNum w:abstractNumId="4" w15:restartNumberingAfterBreak="0">
+  <w:abstractNum w:abstractNumId="8" w15:restartNumberingAfterBreak="0">
+    <w:nsid w:val="5ACA4CCC"/>
+    <w:multiLevelType w:val="hybridMultilevel"/>
+    <w:tmpl w:val="F746D7B0"/>
+    <w:lvl w:ilvl="0" w:tplc="040E0001">
+      <w:start w:val="1"/>
+      <w:numFmt w:val="bullet"/>
+      <w:lvlText w:val=""/>
+      <w:lvlJc w:val="left"/>
+      <w:pPr>
+        <w:ind w:left="720" w:hanging="360"/>
+      </w:pPr>
+      <w:rPr>
+        <w:rFonts w:ascii="Symbol" w:hAnsi="Symbol" w:hint="default"/>
+      </w:rPr>
+    </w:lvl>
+    <w:lvl w:ilvl="1" w:tplc="040E0003" w:tentative="1">
+      <w:start w:val="1"/>
+      <w:numFmt w:val="bullet"/>
+      <w:lvlText w:val="o"/>
+      <w:lvlJc w:val="left"/>
+      <w:pPr>
+        <w:ind w:left="1440" w:hanging="360"/>
+      </w:pPr>
+      <w:rPr>
+        <w:rFonts w:ascii="Courier New" w:hAnsi="Courier New" w:cs="Courier New" w:hint="default"/>
+      </w:rPr>
+    </w:lvl>
+    <w:lvl w:ilvl="2" w:tplc="040E0005" w:tentative="1">
+      <w:start w:val="1"/>
+      <w:numFmt w:val="bullet"/>
+      <w:lvlText w:val=""/>
+      <w:lvlJc w:val="left"/>
+      <w:pPr>
+        <w:ind w:left="2160" w:hanging="360"/>
+      </w:pPr>
+      <w:rPr>
+        <w:rFonts w:ascii="Wingdings" w:hAnsi="Wingdings" w:hint="default"/>
+      </w:rPr>
+    </w:lvl>
+    <w:lvl w:ilvl="3" w:tplc="040E0001" w:tentative="1">
+      <w:start w:val="1"/>
+      <w:numFmt w:val="bullet"/>
+      <w:lvlText w:val=""/>
+      <w:lvlJc w:val="left"/>
+      <w:pPr>
+        <w:ind w:left="2880" w:hanging="360"/>
+      </w:pPr>
+      <w:rPr>
+        <w:rFonts w:ascii="Symbol" w:hAnsi="Symbol" w:hint="default"/>
+      </w:rPr>
+    </w:lvl>
+    <w:lvl w:ilvl="4" w:tplc="040E0003" w:tentative="1">
+      <w:start w:val="1"/>
+      <w:numFmt w:val="bullet"/>
+      <w:lvlText w:val="o"/>
+      <w:lvlJc w:val="left"/>
+      <w:pPr>
+        <w:ind w:left="3600" w:hanging="360"/>
+      </w:pPr>
+      <w:rPr>
+        <w:rFonts w:ascii="Courier New" w:hAnsi="Courier New" w:cs="Courier New" w:hint="default"/>
+      </w:rPr>
+    </w:lvl>
+    <w:lvl w:ilvl="5" w:tplc="040E0005" w:tentative="1">
+      <w:start w:val="1"/>
+      <w:numFmt w:val="bullet"/>
+      <w:lvlText w:val=""/>
+      <w:lvlJc w:val="left"/>
+      <w:pPr>
+        <w:ind w:left="4320" w:hanging="360"/>
+      </w:pPr>
+      <w:rPr>
+        <w:rFonts w:ascii="Wingdings" w:hAnsi="Wingdings" w:hint="default"/>
+      </w:rPr>
+    </w:lvl>
+    <w:lvl w:ilvl="6" w:tplc="040E0001" w:tentative="1">
+      <w:start w:val="1"/>
+      <w:numFmt w:val="bullet"/>
+      <w:lvlText w:val=""/>
+      <w:lvlJc w:val="left"/>
+      <w:pPr>
+        <w:ind w:left="5040" w:hanging="360"/>
+      </w:pPr>
+      <w:rPr>
+        <w:rFonts w:ascii="Symbol" w:hAnsi="Symbol" w:hint="default"/>
+      </w:rPr>
+    </w:lvl>
+    <w:lvl w:ilvl="7" w:tplc="040E0003" w:tentative="1">
+      <w:start w:val="1"/>
+      <w:numFmt w:val="bullet"/>
+      <w:lvlText w:val="o"/>
+      <w:lvlJc w:val="left"/>
+      <w:pPr>
+        <w:ind w:left="5760" w:hanging="360"/>
+      </w:pPr>
+      <w:rPr>
+        <w:rFonts w:ascii="Courier New" w:hAnsi="Courier New" w:cs="Courier New" w:hint="default"/>
+      </w:rPr>
+    </w:lvl>
+    <w:lvl w:ilvl="8" w:tplc="040E0005" w:tentative="1">
+      <w:start w:val="1"/>
+      <w:numFmt w:val="bullet"/>
+      <w:lvlText w:val=""/>
+      <w:lvlJc w:val="left"/>
+      <w:pPr>
+        <w:ind w:left="6480" w:hanging="360"/>
+      </w:pPr>
+      <w:rPr>
+        <w:rFonts w:ascii="Wingdings" w:hAnsi="Wingdings" w:hint="default"/>
+      </w:rPr>
+    </w:lvl>
+  </w:abstractNum>
+  <w:abstractNum w:abstractNumId="9" w15:restartNumberingAfterBreak="0">
     <w:nsid w:val="61CB723B"/>
     <w:multiLevelType w:val="multilevel"/>
     <w:tmpl w:val="36B4F7DC"/>
@@ -3854,7 +5136,7 @@
       </w:rPr>
     </w:lvl>
   </w:abstractNum>
-  <w:abstractNum w:abstractNumId="5" w15:restartNumberingAfterBreak="0">
+  <w:abstractNum w:abstractNumId="10" w15:restartNumberingAfterBreak="0">
     <w:nsid w:val="6FCB00C3"/>
     <w:multiLevelType w:val="hybridMultilevel"/>
     <w:tmpl w:val="C714FB8C"/>
@@ -4066,7 +5348,120 @@
       </w:rPr>
     </w:lvl>
   </w:abstractNum>
-  <w:abstractNum w:abstractNumId="6" w15:restartNumberingAfterBreak="0">
+  <w:abstractNum w:abstractNumId="11" w15:restartNumberingAfterBreak="0">
+    <w:nsid w:val="73C230A1"/>
+    <w:multiLevelType w:val="hybridMultilevel"/>
+    <w:tmpl w:val="B7781890"/>
+    <w:lvl w:ilvl="0" w:tplc="040E0001">
+      <w:start w:val="1"/>
+      <w:numFmt w:val="bullet"/>
+      <w:lvlText w:val=""/>
+      <w:lvlJc w:val="left"/>
+      <w:pPr>
+        <w:ind w:left="720" w:hanging="360"/>
+      </w:pPr>
+      <w:rPr>
+        <w:rFonts w:ascii="Symbol" w:hAnsi="Symbol" w:hint="default"/>
+      </w:rPr>
+    </w:lvl>
+    <w:lvl w:ilvl="1" w:tplc="040E0003" w:tentative="1">
+      <w:start w:val="1"/>
+      <w:numFmt w:val="bullet"/>
+      <w:lvlText w:val="o"/>
+      <w:lvlJc w:val="left"/>
+      <w:pPr>
+        <w:ind w:left="1440" w:hanging="360"/>
+      </w:pPr>
+      <w:rPr>
+        <w:rFonts w:ascii="Courier New" w:hAnsi="Courier New" w:cs="Courier New" w:hint="default"/>
+      </w:rPr>
+    </w:lvl>
+    <w:lvl w:ilvl="2" w:tplc="040E0005" w:tentative="1">
+      <w:start w:val="1"/>
+      <w:numFmt w:val="bullet"/>
+      <w:lvlText w:val=""/>
+      <w:lvlJc w:val="left"/>
+      <w:pPr>
+        <w:ind w:left="2160" w:hanging="360"/>
+      </w:pPr>
+      <w:rPr>
+        <w:rFonts w:ascii="Wingdings" w:hAnsi="Wingdings" w:hint="default"/>
+      </w:rPr>
+    </w:lvl>
+    <w:lvl w:ilvl="3" w:tplc="040E0001" w:tentative="1">
+      <w:start w:val="1"/>
+      <w:numFmt w:val="bullet"/>
+      <w:lvlText w:val=""/>
+      <w:lvlJc w:val="left"/>
+      <w:pPr>
+        <w:ind w:left="2880" w:hanging="360"/>
+      </w:pPr>
+      <w:rPr>
+        <w:rFonts w:ascii="Symbol" w:hAnsi="Symbol" w:hint="default"/>
+      </w:rPr>
+    </w:lvl>
+    <w:lvl w:ilvl="4" w:tplc="040E0003" w:tentative="1">
+      <w:start w:val="1"/>
+      <w:numFmt w:val="bullet"/>
+      <w:lvlText w:val="o"/>
+      <w:lvlJc w:val="left"/>
+      <w:pPr>
+        <w:ind w:left="3600" w:hanging="360"/>
+      </w:pPr>
+      <w:rPr>
+        <w:rFonts w:ascii="Courier New" w:hAnsi="Courier New" w:cs="Courier New" w:hint="default"/>
+      </w:rPr>
+    </w:lvl>
+    <w:lvl w:ilvl="5" w:tplc="040E0005" w:tentative="1">
+      <w:start w:val="1"/>
+      <w:numFmt w:val="bullet"/>
+      <w:lvlText w:val=""/>
+      <w:lvlJc w:val="left"/>
+      <w:pPr>
+        <w:ind w:left="4320" w:hanging="360"/>
+      </w:pPr>
+      <w:rPr>
+        <w:rFonts w:ascii="Wingdings" w:hAnsi="Wingdings" w:hint="default"/>
+      </w:rPr>
+    </w:lvl>
+    <w:lvl w:ilvl="6" w:tplc="040E0001" w:tentative="1">
+      <w:start w:val="1"/>
+      <w:numFmt w:val="bullet"/>
+      <w:lvlText w:val=""/>
+      <w:lvlJc w:val="left"/>
+      <w:pPr>
+        <w:ind w:left="5040" w:hanging="360"/>
+      </w:pPr>
+      <w:rPr>
+        <w:rFonts w:ascii="Symbol" w:hAnsi="Symbol" w:hint="default"/>
+      </w:rPr>
+    </w:lvl>
+    <w:lvl w:ilvl="7" w:tplc="040E0003" w:tentative="1">
+      <w:start w:val="1"/>
+      <w:numFmt w:val="bullet"/>
+      <w:lvlText w:val="o"/>
+      <w:lvlJc w:val="left"/>
+      <w:pPr>
+        <w:ind w:left="5760" w:hanging="360"/>
+      </w:pPr>
+      <w:rPr>
+        <w:rFonts w:ascii="Courier New" w:hAnsi="Courier New" w:cs="Courier New" w:hint="default"/>
+      </w:rPr>
+    </w:lvl>
+    <w:lvl w:ilvl="8" w:tplc="040E0005" w:tentative="1">
+      <w:start w:val="1"/>
+      <w:numFmt w:val="bullet"/>
+      <w:lvlText w:val=""/>
+      <w:lvlJc w:val="left"/>
+      <w:pPr>
+        <w:ind w:left="6480" w:hanging="360"/>
+      </w:pPr>
+      <w:rPr>
+        <w:rFonts w:ascii="Wingdings" w:hAnsi="Wingdings" w:hint="default"/>
+      </w:rPr>
+    </w:lvl>
+  </w:abstractNum>
+  <w:abstractNum w:abstractNumId="12" w15:restartNumberingAfterBreak="0">
     <w:nsid w:val="775678D5"/>
     <w:multiLevelType w:val="hybridMultilevel"/>
     <w:tmpl w:val="C41E4B3E"/>
@@ -4190,7 +5585,156 @@
       </w:rPr>
     </w:lvl>
   </w:abstractNum>
-  <w:abstractNum w:abstractNumId="7" w15:restartNumberingAfterBreak="0">
+  <w:abstractNum w:abstractNumId="13" w15:restartNumberingAfterBreak="0">
+    <w:nsid w:val="792D03AC"/>
+    <w:multiLevelType w:val="multilevel"/>
+    <w:tmpl w:val="2ECEE5CE"/>
+    <w:lvl w:ilvl="0">
+      <w:start w:val="1"/>
+      <w:numFmt w:val="bullet"/>
+      <w:lvlText w:val=""/>
+      <w:lvlJc w:val="left"/>
+      <w:pPr>
+        <w:tabs>
+          <w:tab w:val="num" w:pos="720"/>
+        </w:tabs>
+        <w:ind w:left="720" w:hanging="360"/>
+      </w:pPr>
+      <w:rPr>
+        <w:rFonts w:ascii="Symbol" w:hAnsi="Symbol" w:hint="default"/>
+        <w:sz w:val="20"/>
+      </w:rPr>
+    </w:lvl>
+    <w:lvl w:ilvl="1" w:tentative="1">
+      <w:start w:val="1"/>
+      <w:numFmt w:val="bullet"/>
+      <w:lvlText w:val="o"/>
+      <w:lvlJc w:val="left"/>
+      <w:pPr>
+        <w:tabs>
+          <w:tab w:val="num" w:pos="1440"/>
+        </w:tabs>
+        <w:ind w:left="1440" w:hanging="360"/>
+      </w:pPr>
+      <w:rPr>
+        <w:rFonts w:ascii="Courier New" w:hAnsi="Courier New" w:hint="default"/>
+        <w:sz w:val="20"/>
+      </w:rPr>
+    </w:lvl>
+    <w:lvl w:ilvl="2" w:tentative="1">
+      <w:start w:val="1"/>
+      <w:numFmt w:val="bullet"/>
+      <w:lvlText w:val=""/>
+      <w:lvlJc w:val="left"/>
+      <w:pPr>
+        <w:tabs>
+          <w:tab w:val="num" w:pos="2160"/>
+        </w:tabs>
+        <w:ind w:left="2160" w:hanging="360"/>
+      </w:pPr>
+      <w:rPr>
+        <w:rFonts w:ascii="Wingdings" w:hAnsi="Wingdings" w:hint="default"/>
+        <w:sz w:val="20"/>
+      </w:rPr>
+    </w:lvl>
+    <w:lvl w:ilvl="3" w:tentative="1">
+      <w:start w:val="1"/>
+      <w:numFmt w:val="bullet"/>
+      <w:lvlText w:val=""/>
+      <w:lvlJc w:val="left"/>
+      <w:pPr>
+        <w:tabs>
+          <w:tab w:val="num" w:pos="2880"/>
+        </w:tabs>
+        <w:ind w:left="2880" w:hanging="360"/>
+      </w:pPr>
+      <w:rPr>
+        <w:rFonts w:ascii="Wingdings" w:hAnsi="Wingdings" w:hint="default"/>
+        <w:sz w:val="20"/>
+      </w:rPr>
+    </w:lvl>
+    <w:lvl w:ilvl="4" w:tentative="1">
+      <w:start w:val="1"/>
+      <w:numFmt w:val="bullet"/>
+      <w:lvlText w:val=""/>
+      <w:lvlJc w:val="left"/>
+      <w:pPr>
+        <w:tabs>
+          <w:tab w:val="num" w:pos="3600"/>
+        </w:tabs>
+        <w:ind w:left="3600" w:hanging="360"/>
+      </w:pPr>
+      <w:rPr>
+        <w:rFonts w:ascii="Wingdings" w:hAnsi="Wingdings" w:hint="default"/>
+        <w:sz w:val="20"/>
+      </w:rPr>
+    </w:lvl>
+    <w:lvl w:ilvl="5" w:tentative="1">
+      <w:start w:val="1"/>
+      <w:numFmt w:val="bullet"/>
+      <w:lvlText w:val=""/>
+      <w:lvlJc w:val="left"/>
+      <w:pPr>
+        <w:tabs>
+          <w:tab w:val="num" w:pos="4320"/>
+        </w:tabs>
+        <w:ind w:left="4320" w:hanging="360"/>
+      </w:pPr>
+      <w:rPr>
+        <w:rFonts w:ascii="Wingdings" w:hAnsi="Wingdings" w:hint="default"/>
+        <w:sz w:val="20"/>
+      </w:rPr>
+    </w:lvl>
+    <w:lvl w:ilvl="6" w:tentative="1">
+      <w:start w:val="1"/>
+      <w:numFmt w:val="bullet"/>
+      <w:lvlText w:val=""/>
+      <w:lvlJc w:val="left"/>
+      <w:pPr>
+        <w:tabs>
+          <w:tab w:val="num" w:pos="5040"/>
+        </w:tabs>
+        <w:ind w:left="5040" w:hanging="360"/>
+      </w:pPr>
+      <w:rPr>
+        <w:rFonts w:ascii="Wingdings" w:hAnsi="Wingdings" w:hint="default"/>
+        <w:sz w:val="20"/>
+      </w:rPr>
+    </w:lvl>
+    <w:lvl w:ilvl="7" w:tentative="1">
+      <w:start w:val="1"/>
+      <w:numFmt w:val="bullet"/>
+      <w:lvlText w:val=""/>
+      <w:lvlJc w:val="left"/>
+      <w:pPr>
+        <w:tabs>
+          <w:tab w:val="num" w:pos="5760"/>
+        </w:tabs>
+        <w:ind w:left="5760" w:hanging="360"/>
+      </w:pPr>
+      <w:rPr>
+        <w:rFonts w:ascii="Wingdings" w:hAnsi="Wingdings" w:hint="default"/>
+        <w:sz w:val="20"/>
+      </w:rPr>
+    </w:lvl>
+    <w:lvl w:ilvl="8" w:tentative="1">
+      <w:start w:val="1"/>
+      <w:numFmt w:val="bullet"/>
+      <w:lvlText w:val=""/>
+      <w:lvlJc w:val="left"/>
+      <w:pPr>
+        <w:tabs>
+          <w:tab w:val="num" w:pos="6480"/>
+        </w:tabs>
+        <w:ind w:left="6480" w:hanging="360"/>
+      </w:pPr>
+      <w:rPr>
+        <w:rFonts w:ascii="Wingdings" w:hAnsi="Wingdings" w:hint="default"/>
+        <w:sz w:val="20"/>
+      </w:rPr>
+    </w:lvl>
+  </w:abstractNum>
+  <w:abstractNum w:abstractNumId="14" w15:restartNumberingAfterBreak="0">
     <w:nsid w:val="7BF707CE"/>
     <w:multiLevelType w:val="hybridMultilevel"/>
     <w:tmpl w:val="42D66026"/>
@@ -4303,7 +5847,7 @@
       </w:rPr>
     </w:lvl>
   </w:abstractNum>
-  <w:abstractNum w:abstractNumId="8" w15:restartNumberingAfterBreak="0">
+  <w:abstractNum w:abstractNumId="15" w15:restartNumberingAfterBreak="0">
     <w:nsid w:val="7D3703A8"/>
     <w:multiLevelType w:val="hybridMultilevel"/>
     <w:tmpl w:val="FF8C243A"/>
@@ -4417,10 +5961,10 @@
     </w:lvl>
   </w:abstractNum>
   <w:num w:numId="1" w16cid:durableId="846288006">
-    <w:abstractNumId w:val="4"/>
+    <w:abstractNumId w:val="9"/>
   </w:num>
   <w:num w:numId="2" w16cid:durableId="1919823679">
-    <w:abstractNumId w:val="4"/>
+    <w:abstractNumId w:val="9"/>
     <w:lvlOverride w:ilvl="0">
       <w:startOverride w:val="1"/>
     </w:lvlOverride>
@@ -4450,7 +5994,7 @@
     </w:lvlOverride>
   </w:num>
   <w:num w:numId="3" w16cid:durableId="1603535383">
-    <w:abstractNumId w:val="4"/>
+    <w:abstractNumId w:val="9"/>
     <w:lvlOverride w:ilvl="0">
       <w:startOverride w:val="1"/>
     </w:lvlOverride>
@@ -4480,7 +6024,7 @@
     </w:lvlOverride>
   </w:num>
   <w:num w:numId="4" w16cid:durableId="422186358">
-    <w:abstractNumId w:val="4"/>
+    <w:abstractNumId w:val="9"/>
     <w:lvlOverride w:ilvl="0">
       <w:startOverride w:val="1"/>
     </w:lvlOverride>
@@ -4510,7 +6054,7 @@
     </w:lvlOverride>
   </w:num>
   <w:num w:numId="5" w16cid:durableId="256132139">
-    <w:abstractNumId w:val="4"/>
+    <w:abstractNumId w:val="9"/>
     <w:lvlOverride w:ilvl="0">
       <w:startOverride w:val="1"/>
     </w:lvlOverride>
@@ -4540,7 +6084,7 @@
     </w:lvlOverride>
   </w:num>
   <w:num w:numId="6" w16cid:durableId="557593968">
-    <w:abstractNumId w:val="4"/>
+    <w:abstractNumId w:val="9"/>
     <w:lvlOverride w:ilvl="0">
       <w:startOverride w:val="1"/>
     </w:lvlOverride>
@@ -4570,7 +6114,7 @@
     </w:lvlOverride>
   </w:num>
   <w:num w:numId="7" w16cid:durableId="513151322">
-    <w:abstractNumId w:val="4"/>
+    <w:abstractNumId w:val="9"/>
     <w:lvlOverride w:ilvl="0">
       <w:startOverride w:val="1"/>
     </w:lvlOverride>
@@ -4600,148 +6144,169 @@
     </w:lvlOverride>
   </w:num>
   <w:num w:numId="8" w16cid:durableId="1806971787">
+    <w:abstractNumId w:val="14"/>
+  </w:num>
+  <w:num w:numId="9" w16cid:durableId="1964538679">
+    <w:abstractNumId w:val="9"/>
+    <w:lvlOverride w:ilvl="0">
+      <w:startOverride w:val="1"/>
+    </w:lvlOverride>
+    <w:lvlOverride w:ilvl="1">
+      <w:startOverride w:val="1"/>
+    </w:lvlOverride>
+    <w:lvlOverride w:ilvl="2">
+      <w:startOverride w:val="1"/>
+    </w:lvlOverride>
+    <w:lvlOverride w:ilvl="3">
+      <w:startOverride w:val="1"/>
+    </w:lvlOverride>
+    <w:lvlOverride w:ilvl="4">
+      <w:startOverride w:val="1"/>
+    </w:lvlOverride>
+    <w:lvlOverride w:ilvl="5">
+      <w:startOverride w:val="1"/>
+    </w:lvlOverride>
+    <w:lvlOverride w:ilvl="6">
+      <w:startOverride w:val="1"/>
+    </w:lvlOverride>
+    <w:lvlOverride w:ilvl="7">
+      <w:startOverride w:val="1"/>
+    </w:lvlOverride>
+    <w:lvlOverride w:ilvl="8">
+      <w:startOverride w:val="1"/>
+    </w:lvlOverride>
+  </w:num>
+  <w:num w:numId="10" w16cid:durableId="15887404">
+    <w:abstractNumId w:val="9"/>
+    <w:lvlOverride w:ilvl="0">
+      <w:startOverride w:val="9"/>
+    </w:lvlOverride>
+    <w:lvlOverride w:ilvl="1">
+      <w:startOverride w:val="1"/>
+    </w:lvlOverride>
+    <w:lvlOverride w:ilvl="2">
+      <w:startOverride w:val="1"/>
+    </w:lvlOverride>
+    <w:lvlOverride w:ilvl="3">
+      <w:startOverride w:val="1"/>
+    </w:lvlOverride>
+    <w:lvlOverride w:ilvl="4">
+      <w:startOverride w:val="1"/>
+    </w:lvlOverride>
+    <w:lvlOverride w:ilvl="5">
+      <w:startOverride w:val="1"/>
+    </w:lvlOverride>
+    <w:lvlOverride w:ilvl="6">
+      <w:startOverride w:val="1"/>
+    </w:lvlOverride>
+    <w:lvlOverride w:ilvl="7">
+      <w:startOverride w:val="1"/>
+    </w:lvlOverride>
+    <w:lvlOverride w:ilvl="8">
+      <w:startOverride w:val="1"/>
+    </w:lvlOverride>
+  </w:num>
+  <w:num w:numId="11" w16cid:durableId="1277978621">
+    <w:abstractNumId w:val="9"/>
+    <w:lvlOverride w:ilvl="0">
+      <w:startOverride w:val="1"/>
+    </w:lvlOverride>
+    <w:lvlOverride w:ilvl="1">
+      <w:startOverride w:val="1"/>
+    </w:lvlOverride>
+    <w:lvlOverride w:ilvl="2">
+      <w:startOverride w:val="1"/>
+    </w:lvlOverride>
+    <w:lvlOverride w:ilvl="3">
+      <w:startOverride w:val="1"/>
+    </w:lvlOverride>
+    <w:lvlOverride w:ilvl="4">
+      <w:startOverride w:val="1"/>
+    </w:lvlOverride>
+    <w:lvlOverride w:ilvl="5">
+      <w:startOverride w:val="1"/>
+    </w:lvlOverride>
+    <w:lvlOverride w:ilvl="6">
+      <w:startOverride w:val="1"/>
+    </w:lvlOverride>
+    <w:lvlOverride w:ilvl="7">
+      <w:startOverride w:val="1"/>
+    </w:lvlOverride>
+    <w:lvlOverride w:ilvl="8">
+      <w:startOverride w:val="1"/>
+    </w:lvlOverride>
+  </w:num>
+  <w:num w:numId="12" w16cid:durableId="1530874771">
+    <w:abstractNumId w:val="10"/>
+  </w:num>
+  <w:num w:numId="13" w16cid:durableId="1303463559">
     <w:abstractNumId w:val="7"/>
   </w:num>
-  <w:num w:numId="9" w16cid:durableId="1964538679">
-    <w:abstractNumId w:val="4"/>
-    <w:lvlOverride w:ilvl="0">
-      <w:startOverride w:val="1"/>
-    </w:lvlOverride>
-    <w:lvlOverride w:ilvl="1">
-      <w:startOverride w:val="1"/>
-    </w:lvlOverride>
-    <w:lvlOverride w:ilvl="2">
-      <w:startOverride w:val="1"/>
-    </w:lvlOverride>
-    <w:lvlOverride w:ilvl="3">
-      <w:startOverride w:val="1"/>
-    </w:lvlOverride>
-    <w:lvlOverride w:ilvl="4">
-      <w:startOverride w:val="1"/>
-    </w:lvlOverride>
-    <w:lvlOverride w:ilvl="5">
-      <w:startOverride w:val="1"/>
-    </w:lvlOverride>
-    <w:lvlOverride w:ilvl="6">
-      <w:startOverride w:val="1"/>
-    </w:lvlOverride>
-    <w:lvlOverride w:ilvl="7">
-      <w:startOverride w:val="1"/>
-    </w:lvlOverride>
-    <w:lvlOverride w:ilvl="8">
-      <w:startOverride w:val="1"/>
-    </w:lvlOverride>
+  <w:num w:numId="14" w16cid:durableId="2109886121">
+    <w:abstractNumId w:val="12"/>
   </w:num>
-  <w:num w:numId="10" w16cid:durableId="15887404">
-    <w:abstractNumId w:val="4"/>
-    <w:lvlOverride w:ilvl="0">
-      <w:startOverride w:val="9"/>
-    </w:lvlOverride>
-    <w:lvlOverride w:ilvl="1">
-      <w:startOverride w:val="1"/>
-    </w:lvlOverride>
-    <w:lvlOverride w:ilvl="2">
-      <w:startOverride w:val="1"/>
-    </w:lvlOverride>
-    <w:lvlOverride w:ilvl="3">
-      <w:startOverride w:val="1"/>
-    </w:lvlOverride>
-    <w:lvlOverride w:ilvl="4">
-      <w:startOverride w:val="1"/>
-    </w:lvlOverride>
-    <w:lvlOverride w:ilvl="5">
-      <w:startOverride w:val="1"/>
-    </w:lvlOverride>
-    <w:lvlOverride w:ilvl="6">
-      <w:startOverride w:val="1"/>
-    </w:lvlOverride>
-    <w:lvlOverride w:ilvl="7">
-      <w:startOverride w:val="1"/>
-    </w:lvlOverride>
-    <w:lvlOverride w:ilvl="8">
-      <w:startOverride w:val="1"/>
-    </w:lvlOverride>
-  </w:num>
-  <w:num w:numId="11" w16cid:durableId="1277978621">
-    <w:abstractNumId w:val="4"/>
-    <w:lvlOverride w:ilvl="0">
-      <w:startOverride w:val="1"/>
-    </w:lvlOverride>
-    <w:lvlOverride w:ilvl="1">
-      <w:startOverride w:val="1"/>
-    </w:lvlOverride>
-    <w:lvlOverride w:ilvl="2">
-      <w:startOverride w:val="1"/>
-    </w:lvlOverride>
-    <w:lvlOverride w:ilvl="3">
-      <w:startOverride w:val="1"/>
-    </w:lvlOverride>
-    <w:lvlOverride w:ilvl="4">
-      <w:startOverride w:val="1"/>
-    </w:lvlOverride>
-    <w:lvlOverride w:ilvl="5">
-      <w:startOverride w:val="1"/>
-    </w:lvlOverride>
-    <w:lvlOverride w:ilvl="6">
-      <w:startOverride w:val="1"/>
-    </w:lvlOverride>
-    <w:lvlOverride w:ilvl="7">
-      <w:startOverride w:val="1"/>
-    </w:lvlOverride>
-    <w:lvlOverride w:ilvl="8">
-      <w:startOverride w:val="1"/>
-    </w:lvlOverride>
-  </w:num>
-  <w:num w:numId="12" w16cid:durableId="1530874771">
+  <w:num w:numId="15" w16cid:durableId="1225214267">
     <w:abstractNumId w:val="5"/>
   </w:num>
-  <w:num w:numId="13" w16cid:durableId="1303463559">
+  <w:num w:numId="16" w16cid:durableId="456216154">
+    <w:abstractNumId w:val="9"/>
+    <w:lvlOverride w:ilvl="0">
+      <w:startOverride w:val="1"/>
+    </w:lvlOverride>
+    <w:lvlOverride w:ilvl="1">
+      <w:startOverride w:val="1"/>
+    </w:lvlOverride>
+    <w:lvlOverride w:ilvl="2">
+      <w:startOverride w:val="1"/>
+    </w:lvlOverride>
+    <w:lvlOverride w:ilvl="3">
+      <w:startOverride w:val="1"/>
+    </w:lvlOverride>
+    <w:lvlOverride w:ilvl="4">
+      <w:startOverride w:val="1"/>
+    </w:lvlOverride>
+    <w:lvlOverride w:ilvl="5">
+      <w:startOverride w:val="1"/>
+    </w:lvlOverride>
+    <w:lvlOverride w:ilvl="6">
+      <w:startOverride w:val="1"/>
+    </w:lvlOverride>
+    <w:lvlOverride w:ilvl="7">
+      <w:startOverride w:val="1"/>
+    </w:lvlOverride>
+    <w:lvlOverride w:ilvl="8">
+      <w:startOverride w:val="1"/>
+    </w:lvlOverride>
+  </w:num>
+  <w:num w:numId="17" w16cid:durableId="1855528978">
     <w:abstractNumId w:val="3"/>
   </w:num>
-  <w:num w:numId="14" w16cid:durableId="2109886121">
-    <w:abstractNumId w:val="6"/>
-  </w:num>
-  <w:num w:numId="15" w16cid:durableId="1225214267">
-    <w:abstractNumId w:val="2"/>
-  </w:num>
-  <w:num w:numId="16" w16cid:durableId="456216154">
-    <w:abstractNumId w:val="4"/>
-    <w:lvlOverride w:ilvl="0">
-      <w:startOverride w:val="1"/>
-    </w:lvlOverride>
-    <w:lvlOverride w:ilvl="1">
-      <w:startOverride w:val="1"/>
-    </w:lvlOverride>
-    <w:lvlOverride w:ilvl="2">
-      <w:startOverride w:val="1"/>
-    </w:lvlOverride>
-    <w:lvlOverride w:ilvl="3">
-      <w:startOverride w:val="1"/>
-    </w:lvlOverride>
-    <w:lvlOverride w:ilvl="4">
-      <w:startOverride w:val="1"/>
-    </w:lvlOverride>
-    <w:lvlOverride w:ilvl="5">
-      <w:startOverride w:val="1"/>
-    </w:lvlOverride>
-    <w:lvlOverride w:ilvl="6">
-      <w:startOverride w:val="1"/>
-    </w:lvlOverride>
-    <w:lvlOverride w:ilvl="7">
-      <w:startOverride w:val="1"/>
-    </w:lvlOverride>
-    <w:lvlOverride w:ilvl="8">
-      <w:startOverride w:val="1"/>
-    </w:lvlOverride>
-  </w:num>
-  <w:num w:numId="17" w16cid:durableId="1855528978">
-    <w:abstractNumId w:val="1"/>
-  </w:num>
   <w:num w:numId="18" w16cid:durableId="1802652368">
-    <w:abstractNumId w:val="8"/>
+    <w:abstractNumId w:val="15"/>
   </w:num>
   <w:num w:numId="19" w16cid:durableId="308680502">
     <w:abstractNumId w:val="0"/>
+  </w:num>
+  <w:num w:numId="20" w16cid:durableId="281230999">
+    <w:abstractNumId w:val="11"/>
+  </w:num>
+  <w:num w:numId="21" w16cid:durableId="646134155">
+    <w:abstractNumId w:val="8"/>
+  </w:num>
+  <w:num w:numId="22" w16cid:durableId="395474856">
+    <w:abstractNumId w:val="1"/>
+  </w:num>
+  <w:num w:numId="23" w16cid:durableId="1053582573">
+    <w:abstractNumId w:val="6"/>
+  </w:num>
+  <w:num w:numId="24" w16cid:durableId="1813517667">
+    <w:abstractNumId w:val="4"/>
+  </w:num>
+  <w:num w:numId="25" w16cid:durableId="669259440">
+    <w:abstractNumId w:val="2"/>
+  </w:num>
+  <w:num w:numId="26" w16cid:durableId="1193836023">
+    <w:abstractNumId w:val="13"/>
   </w:num>
 </w:numbering>
 </file>
@@ -5983,6 +7548,47 @@
       </w:tblBorders>
     </w:tblPr>
   </w:style>
+  <w:style w:type="paragraph" w:styleId="NormlWeb">
+    <w:name w:val="Normal (Web)"/>
+    <w:basedOn w:val="Norml"/>
+    <w:uiPriority w:val="99"/>
+    <w:unhideWhenUsed/>
+    <w:rsid w:val="00827223"/>
+    <w:pPr>
+      <w:spacing w:before="100" w:beforeAutospacing="1" w:after="100" w:afterAutospacing="1" w:line="240" w:lineRule="auto"/>
+      <w:ind w:firstLine="0"/>
+      <w:jc w:val="left"/>
+    </w:pPr>
+    <w:rPr>
+      <w:rFonts w:eastAsia="Times New Roman" w:cs="Times New Roman"/>
+      <w:szCs w:val="24"/>
+      <w:lang w:eastAsia="hu-HU"/>
+    </w:rPr>
+  </w:style>
+  <w:style w:type="character" w:styleId="Kiemels2">
+    <w:name w:val="Strong"/>
+    <w:basedOn w:val="Bekezdsalapbettpusa"/>
+    <w:uiPriority w:val="22"/>
+    <w:qFormat/>
+    <w:rsid w:val="00827223"/>
+    <w:rPr>
+      <w:b/>
+      <w:bCs/>
+    </w:rPr>
+  </w:style>
+  <w:style w:type="character" w:styleId="HTML-kd">
+    <w:name w:val="HTML Code"/>
+    <w:basedOn w:val="Bekezdsalapbettpusa"/>
+    <w:uiPriority w:val="99"/>
+    <w:semiHidden/>
+    <w:unhideWhenUsed/>
+    <w:rsid w:val="00827223"/>
+    <w:rPr>
+      <w:rFonts w:ascii="Courier New" w:eastAsia="Times New Roman" w:hAnsi="Courier New" w:cs="Courier New"/>
+      <w:sz w:val="20"/>
+      <w:szCs w:val="20"/>
+    </w:rPr>
+  </w:style>
 </w:styles>
 </file>
 

</xml_diff>